<commit_message>
bugfix/213-integrate-database - Added Interests schema and uspGetPhotoGalleryImageLinks with tSQLt Tests
</commit_message>
<xml_diff>
--- a/src/Ash.Portfolio.Web/wwwroot/docs/Ashley Gibson CV.docx
+++ b/src/Ash.Portfolio.Web/wwwroot/docs/Ashley Gibson CV.docx
@@ -1,6 +1,6 @@
 
 <file path=word/document.xml><?xml version="1.0" encoding="utf-8"?>
-<w:document xmlns:wpc="http://schemas.microsoft.com/office/word/2010/wordprocessingCanvas" xmlns:cx="http://schemas.microsoft.com/office/drawing/2014/chartex" xmlns:cx1="http://schemas.microsoft.com/office/drawing/2015/9/8/chartex" xmlns:cx2="http://schemas.microsoft.com/office/drawing/2015/10/21/chartex" xmlns:cx3="http://schemas.microsoft.com/office/drawing/2016/5/9/chartex" xmlns:cx4="http://schemas.microsoft.com/office/drawing/2016/5/10/chartex" xmlns:cx5="http://schemas.microsoft.com/office/drawing/2016/5/11/chartex" xmlns:cx6="http://schemas.microsoft.com/office/drawing/2016/5/12/chartex" xmlns:cx7="http://schemas.microsoft.com/office/drawing/2016/5/13/chartex" xmlns:cx8="http://schemas.microsoft.com/office/drawing/2016/5/14/chartex" xmlns:mc="http://schemas.openxmlformats.org/markup-compatibility/2006" xmlns:aink="http://schemas.microsoft.com/office/drawing/2016/ink" xmlns:am3d="http://schemas.microsoft.com/office/drawing/2017/model3d" xmlns:o="urn:schemas-microsoft-com:office:office" xmlns:oel="http://schemas.microsoft.com/office/2019/extlst" xmlns:r="http://schemas.openxmlformats.org/officeDocument/2006/relationships" xmlns:m="http://schemas.openxmlformats.org/officeDocument/2006/math" xmlns:v="urn:schemas-microsoft-com:vml" xmlns:wp14="http://schemas.microsoft.com/office/word/2010/wordprocessingDrawing" xmlns:wp="http://schemas.openxmlformats.org/drawingml/2006/wordprocessingDrawing" xmlns:w10="urn:schemas-microsoft-com:office:word" xmlns:w="http://schemas.openxmlformats.org/wordprocessingml/2006/main" xmlns:w14="http://schemas.microsoft.com/office/word/2010/wordml" xmlns:w15="http://schemas.microsoft.com/office/word/2012/wordml" xmlns:w16cex="http://schemas.microsoft.com/office/word/2018/wordml/cex" xmlns:w16cid="http://schemas.microsoft.com/office/word/2016/wordml/cid" xmlns:w16="http://schemas.microsoft.com/office/word/2018/wordml" xmlns:w16sdtdh="http://schemas.microsoft.com/office/word/2020/wordml/sdtdatahash" xmlns:w16se="http://schemas.microsoft.com/office/word/2015/wordml/symex" xmlns:wpg="http://schemas.microsoft.com/office/word/2010/wordprocessingGroup" xmlns:wpi="http://schemas.microsoft.com/office/word/2010/wordprocessingInk" xmlns:wne="http://schemas.microsoft.com/office/word/2006/wordml" xmlns:wps="http://schemas.microsoft.com/office/word/2010/wordprocessingShape" mc:Ignorable="w14 w15 w16se w16cid w16 w16cex w16sdtdh wp14">
+<w:document xmlns:wpc="http://schemas.microsoft.com/office/word/2010/wordprocessingCanvas" xmlns:cx="http://schemas.microsoft.com/office/drawing/2014/chartex" xmlns:cx1="http://schemas.microsoft.com/office/drawing/2015/9/8/chartex" xmlns:cx2="http://schemas.microsoft.com/office/drawing/2015/10/21/chartex" xmlns:cx3="http://schemas.microsoft.com/office/drawing/2016/5/9/chartex" xmlns:cx4="http://schemas.microsoft.com/office/drawing/2016/5/10/chartex" xmlns:cx5="http://schemas.microsoft.com/office/drawing/2016/5/11/chartex" xmlns:cx6="http://schemas.microsoft.com/office/drawing/2016/5/12/chartex" xmlns:cx7="http://schemas.microsoft.com/office/drawing/2016/5/13/chartex" xmlns:cx8="http://schemas.microsoft.com/office/drawing/2016/5/14/chartex" xmlns:mc="http://schemas.openxmlformats.org/markup-compatibility/2006" xmlns:aink="http://schemas.microsoft.com/office/drawing/2016/ink" xmlns:am3d="http://schemas.microsoft.com/office/drawing/2017/model3d" xmlns:o="urn:schemas-microsoft-com:office:office" xmlns:oel="http://schemas.microsoft.com/office/2019/extlst" xmlns:r="http://schemas.openxmlformats.org/officeDocument/2006/relationships" xmlns:m="http://schemas.openxmlformats.org/officeDocument/2006/math" xmlns:v="urn:schemas-microsoft-com:vml" xmlns:wp14="http://schemas.microsoft.com/office/word/2010/wordprocessingDrawing" xmlns:wp="http://schemas.openxmlformats.org/drawingml/2006/wordprocessingDrawing" xmlns:w10="urn:schemas-microsoft-com:office:word" xmlns:w="http://schemas.openxmlformats.org/wordprocessingml/2006/main" xmlns:w14="http://schemas.microsoft.com/office/word/2010/wordml" xmlns:w15="http://schemas.microsoft.com/office/word/2012/wordml" xmlns:w16cex="http://schemas.microsoft.com/office/word/2018/wordml/cex" xmlns:w16cid="http://schemas.microsoft.com/office/word/2016/wordml/cid" xmlns:w16="http://schemas.microsoft.com/office/word/2018/wordml" xmlns:w16du="http://schemas.microsoft.com/office/word/2023/wordml/word16du" xmlns:w16sdtdh="http://schemas.microsoft.com/office/word/2020/wordml/sdtdatahash" xmlns:w16se="http://schemas.microsoft.com/office/word/2015/wordml/symex" xmlns:wpg="http://schemas.microsoft.com/office/word/2010/wordprocessingGroup" xmlns:wpi="http://schemas.microsoft.com/office/word/2010/wordprocessingInk" xmlns:wne="http://schemas.microsoft.com/office/word/2006/wordml" xmlns:wps="http://schemas.microsoft.com/office/word/2010/wordprocessingShape" mc:Ignorable="w14 w15 w16se w16cid w16 w16cex w16sdtdh w16du wp14">
   <w:body>
     <w:p>
       <w:pPr>
@@ -103,7 +103,7 @@
                 <v:stroke joinstyle="miter"/>
                 <v:path gradientshapeok="t" o:connecttype="rect"/>
               </v:shapetype>
-              <v:shape id="Text Box 2" o:spid="_x0000_s1026" type="#_x0000_t202" style="position:absolute;left:0;text-align:left;margin-left:201.55pt;margin-top:8.1pt;width:160.5pt;height:28.5pt;z-index:251658244;visibility:visible;mso-wrap-style:square;mso-width-percent:0;mso-height-percent:0;mso-wrap-distance-left:9pt;mso-wrap-distance-top:0;mso-wrap-distance-right:9pt;mso-wrap-distance-bottom:0;mso-position-horizontal:absolute;mso-position-horizontal-relative:margin;mso-position-vertical:absolute;mso-position-vertical-relative:text;mso-width-percent:0;mso-height-percent:0;mso-width-relative:margin;mso-height-relative:margin;v-text-anchor:top" o:gfxdata="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" filled="f" stroked="f">
+              <v:shape id="Text Box 2" o:spid="_x0000_s1026" type="#_x0000_t202" style="position:absolute;left:0;text-align:left;margin-left:201.55pt;margin-top:8.1pt;width:160.5pt;height:28.5pt;z-index:251658244;visibility:visible;mso-wrap-style:square;mso-width-percent:0;mso-height-percent:0;mso-wrap-distance-left:9pt;mso-wrap-distance-top:0;mso-wrap-distance-right:9pt;mso-wrap-distance-bottom:0;mso-position-horizontal:absolute;mso-position-horizontal-relative:margin;mso-position-vertical:absolute;mso-position-vertical-relative:text;mso-width-percent:0;mso-height-percent:0;mso-width-relative:margin;mso-height-relative:margin;v-text-anchor:top" o:gfxdata="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" filled="f" stroked="f">
                 <v:textbox>
                   <w:txbxContent>
                     <w:p>
@@ -144,15 +144,194 @@
       <w:r>
         <w:rPr>
           <w:rFonts w:ascii="Gill Sans MT" w:hAnsi="Gill Sans MT" w:cs="Tahoma"/>
+          <w:noProof/>
+          <w:szCs w:val="20"/>
+          <w:lang w:eastAsia="en-GB"/>
+        </w:rPr>
+        <mc:AlternateContent>
+          <mc:Choice Requires="wps">
+            <w:drawing>
+              <wp:anchor distT="0" distB="0" distL="114300" distR="114300" simplePos="0" relativeHeight="251632640" behindDoc="0" locked="0" layoutInCell="1" allowOverlap="1" wp14:anchorId="6537B1D2" wp14:editId="124EA5DF">
+                <wp:simplePos x="0" y="0"/>
+                <wp:positionH relativeFrom="margin">
+                  <wp:posOffset>5398135</wp:posOffset>
+                </wp:positionH>
+                <wp:positionV relativeFrom="margin">
+                  <wp:posOffset>476250</wp:posOffset>
+                </wp:positionV>
+                <wp:extent cx="1419225" cy="285750"/>
+                <wp:effectExtent l="0" t="0" r="0" b="0"/>
+                <wp:wrapNone/>
+                <wp:docPr id="307" name="Text Box 2"/>
+                <wp:cNvGraphicFramePr>
+                  <a:graphicFrameLocks xmlns:a="http://schemas.openxmlformats.org/drawingml/2006/main"/>
+                </wp:cNvGraphicFramePr>
+                <a:graphic xmlns:a="http://schemas.openxmlformats.org/drawingml/2006/main">
+                  <a:graphicData uri="http://schemas.microsoft.com/office/word/2010/wordprocessingShape">
+                    <wps:wsp>
+                      <wps:cNvSpPr txBox="1">
+                        <a:spLocks noChangeArrowheads="1"/>
+                      </wps:cNvSpPr>
+                      <wps:spPr bwMode="auto">
+                        <a:xfrm>
+                          <a:off x="0" y="0"/>
+                          <a:ext cx="1419225" cy="285750"/>
+                        </a:xfrm>
+                        <a:prstGeom prst="rect">
+                          <a:avLst/>
+                        </a:prstGeom>
+                        <a:noFill/>
+                        <a:ln w="9525">
+                          <a:noFill/>
+                          <a:miter lim="800000"/>
+                          <a:headEnd/>
+                          <a:tailEnd/>
+                        </a:ln>
+                      </wps:spPr>
+                      <wps:txbx>
+                        <w:txbxContent>
+                          <w:p>
+                            <w:pPr>
+                              <w:jc w:val="center"/>
+                              <w:rPr>
+                                <w:rFonts w:ascii="Gill Sans MT" w:hAnsi="Gill Sans MT" w:cs="Tahoma"/>
+                                <w:b/>
+                                <w:bCs/>
+                              </w:rPr>
+                            </w:pPr>
+                            <w:hyperlink r:id="rId8" w:history="1">
+                              <w:r>
+                                <w:rPr>
+                                  <w:rStyle w:val="Hyperlink"/>
+                                  <w:rFonts w:ascii="Gill Sans MT" w:hAnsi="Gill Sans MT" w:cs="Tahoma"/>
+                                  <w:b/>
+                                  <w:bCs/>
+                                  <w:u w:val="none"/>
+                                </w:rPr>
+                                <w:t>Chesterfield</w:t>
+                              </w:r>
+                              <w:r>
+                                <w:rPr>
+                                  <w:rStyle w:val="Hyperlink"/>
+                                  <w:rFonts w:ascii="Gill Sans MT" w:hAnsi="Gill Sans MT" w:cs="Tahoma"/>
+                                  <w:b/>
+                                  <w:bCs/>
+                                  <w:u w:val="none"/>
+                                </w:rPr>
+                                <w:t>,</w:t>
+                              </w:r>
+                              <w:r>
+                                <w:rPr>
+                                  <w:rStyle w:val="Hyperlink"/>
+                                  <w:rFonts w:ascii="Gill Sans MT" w:hAnsi="Gill Sans MT" w:cs="Tahoma"/>
+                                  <w:b/>
+                                  <w:bCs/>
+                                  <w:u w:val="none"/>
+                                </w:rPr>
+                                <w:t xml:space="preserve"> S43</w:t>
+                              </w:r>
+                            </w:hyperlink>
+                            <w:r>
+                              <w:rPr>
+                                <w:rFonts w:ascii="Gill Sans MT" w:hAnsi="Gill Sans MT" w:cs="Tahoma"/>
+                                <w:b/>
+                                <w:bCs/>
+                              </w:rPr>
+                              <w:br/>
+                            </w:r>
+                          </w:p>
+                        </w:txbxContent>
+                      </wps:txbx>
+                      <wps:bodyPr rot="0" vert="horz" wrap="square" lIns="91440" tIns="45720" rIns="91440" bIns="45720" anchor="t" anchorCtr="0">
+                        <a:noAutofit/>
+                      </wps:bodyPr>
+                    </wps:wsp>
+                  </a:graphicData>
+                </a:graphic>
+                <wp14:sizeRelH relativeFrom="margin">
+                  <wp14:pctWidth>0</wp14:pctWidth>
+                </wp14:sizeRelH>
+                <wp14:sizeRelV relativeFrom="margin">
+                  <wp14:pctHeight>0</wp14:pctHeight>
+                </wp14:sizeRelV>
+              </wp:anchor>
+            </w:drawing>
+          </mc:Choice>
+          <mc:Fallback>
+            <w:pict>
+              <v:shape w14:anchorId="6537B1D2" id="_x0000_s1027" type="#_x0000_t202" style="position:absolute;margin-left:425.05pt;margin-top:37.5pt;width:111.75pt;height:22.5pt;z-index:251632640;visibility:visible;mso-wrap-style:square;mso-width-percent:0;mso-height-percent:0;mso-wrap-distance-left:9pt;mso-wrap-distance-top:0;mso-wrap-distance-right:9pt;mso-wrap-distance-bottom:0;mso-position-horizontal:absolute;mso-position-horizontal-relative:margin;mso-position-vertical:absolute;mso-position-vertical-relative:margin;mso-width-percent:0;mso-height-percent:0;mso-width-relative:margin;mso-height-relative:margin;v-text-anchor:top" o:gfxdata="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" filled="f" stroked="f">
+                <v:textbox>
+                  <w:txbxContent>
+                    <w:p>
+                      <w:pPr>
+                        <w:jc w:val="center"/>
+                        <w:rPr>
+                          <w:rFonts w:ascii="Gill Sans MT" w:hAnsi="Gill Sans MT" w:cs="Tahoma"/>
+                          <w:b/>
+                          <w:bCs/>
+                        </w:rPr>
+                      </w:pPr>
+                      <w:hyperlink r:id="rId9" w:history="1">
+                        <w:r>
+                          <w:rPr>
+                            <w:rStyle w:val="Hyperlink"/>
+                            <w:rFonts w:ascii="Gill Sans MT" w:hAnsi="Gill Sans MT" w:cs="Tahoma"/>
+                            <w:b/>
+                            <w:bCs/>
+                            <w:u w:val="none"/>
+                          </w:rPr>
+                          <w:t>Chesterfield</w:t>
+                        </w:r>
+                        <w:r>
+                          <w:rPr>
+                            <w:rStyle w:val="Hyperlink"/>
+                            <w:rFonts w:ascii="Gill Sans MT" w:hAnsi="Gill Sans MT" w:cs="Tahoma"/>
+                            <w:b/>
+                            <w:bCs/>
+                            <w:u w:val="none"/>
+                          </w:rPr>
+                          <w:t>,</w:t>
+                        </w:r>
+                        <w:r>
+                          <w:rPr>
+                            <w:rStyle w:val="Hyperlink"/>
+                            <w:rFonts w:ascii="Gill Sans MT" w:hAnsi="Gill Sans MT" w:cs="Tahoma"/>
+                            <w:b/>
+                            <w:bCs/>
+                            <w:u w:val="none"/>
+                          </w:rPr>
+                          <w:t xml:space="preserve"> S43</w:t>
+                        </w:r>
+                      </w:hyperlink>
+                      <w:r>
+                        <w:rPr>
+                          <w:rFonts w:ascii="Gill Sans MT" w:hAnsi="Gill Sans MT" w:cs="Tahoma"/>
+                          <w:b/>
+                          <w:bCs/>
+                        </w:rPr>
+                        <w:br/>
+                      </w:r>
+                    </w:p>
+                  </w:txbxContent>
+                </v:textbox>
+                <w10:wrap anchorx="margin" anchory="margin"/>
+              </v:shape>
+            </w:pict>
+          </mc:Fallback>
+        </mc:AlternateContent>
+      </w:r>
+      <w:r>
+        <w:rPr>
+          <w:rFonts w:ascii="Gill Sans MT" w:hAnsi="Gill Sans MT" w:cs="Tahoma"/>
           <w:b/>
           <w:noProof/>
           <w:szCs w:val="20"/>
         </w:rPr>
         <w:drawing>
-          <wp:anchor distT="0" distB="0" distL="114300" distR="114300" simplePos="0" relativeHeight="251658250" behindDoc="0" locked="0" layoutInCell="1" allowOverlap="1" wp14:anchorId="20BD84DD" wp14:editId="2C24DAED">
+          <wp:anchor distT="0" distB="0" distL="114300" distR="114300" simplePos="0" relativeHeight="251672576" behindDoc="0" locked="0" layoutInCell="1" allowOverlap="1" wp14:anchorId="20BD84DD" wp14:editId="73BE71B9">
             <wp:simplePos x="0" y="0"/>
             <wp:positionH relativeFrom="column">
-              <wp:posOffset>5474335</wp:posOffset>
+              <wp:posOffset>5356225</wp:posOffset>
             </wp:positionH>
             <wp:positionV relativeFrom="paragraph">
               <wp:posOffset>207645</wp:posOffset>
@@ -172,7 +351,7 @@
                     <pic:cNvPicPr/>
                   </pic:nvPicPr>
                   <pic:blipFill>
-                    <a:blip r:embed="rId8" cstate="print">
+                    <a:blip r:embed="rId10" cstate="print">
                       <a:extLst>
                         <a:ext uri="{28A0092B-C50C-407E-A947-70E740481C1C}">
                           <a14:useLocalDpi xmlns:a14="http://schemas.microsoft.com/office/drawing/2010/main" val="0"/>
@@ -201,158 +380,15 @@
       <w:r>
         <w:rPr>
           <w:rFonts w:ascii="Gill Sans MT" w:hAnsi="Gill Sans MT" w:cs="Tahoma"/>
-          <w:noProof/>
-          <w:szCs w:val="20"/>
-          <w:lang w:eastAsia="en-GB"/>
-        </w:rPr>
-        <mc:AlternateContent>
-          <mc:Choice Requires="wps">
-            <w:drawing>
-              <wp:anchor distT="0" distB="0" distL="114300" distR="114300" simplePos="0" relativeHeight="251658240" behindDoc="0" locked="0" layoutInCell="1" allowOverlap="1" wp14:anchorId="6537B1D2" wp14:editId="6BC3858F">
-                <wp:simplePos x="0" y="0"/>
-                <wp:positionH relativeFrom="margin">
-                  <wp:posOffset>5601335</wp:posOffset>
-                </wp:positionH>
-                <wp:positionV relativeFrom="margin">
-                  <wp:posOffset>476250</wp:posOffset>
-                </wp:positionV>
-                <wp:extent cx="1162050" cy="234950"/>
-                <wp:effectExtent l="0" t="0" r="0" b="0"/>
-                <wp:wrapNone/>
-                <wp:docPr id="307" name="Text Box 2"/>
-                <wp:cNvGraphicFramePr>
-                  <a:graphicFrameLocks xmlns:a="http://schemas.openxmlformats.org/drawingml/2006/main"/>
-                </wp:cNvGraphicFramePr>
-                <a:graphic xmlns:a="http://schemas.openxmlformats.org/drawingml/2006/main">
-                  <a:graphicData uri="http://schemas.microsoft.com/office/word/2010/wordprocessingShape">
-                    <wps:wsp>
-                      <wps:cNvSpPr txBox="1">
-                        <a:spLocks noChangeArrowheads="1"/>
-                      </wps:cNvSpPr>
-                      <wps:spPr bwMode="auto">
-                        <a:xfrm>
-                          <a:off x="0" y="0"/>
-                          <a:ext cx="1162050" cy="234950"/>
-                        </a:xfrm>
-                        <a:prstGeom prst="rect">
-                          <a:avLst/>
-                        </a:prstGeom>
-                        <a:noFill/>
-                        <a:ln w="9525">
-                          <a:noFill/>
-                          <a:miter lim="800000"/>
-                          <a:headEnd/>
-                          <a:tailEnd/>
-                        </a:ln>
-                      </wps:spPr>
-                      <wps:txbx>
-                        <w:txbxContent>
-                          <w:p>
-                            <w:pPr>
-                              <w:jc w:val="center"/>
-                              <w:rPr>
-                                <w:rFonts w:ascii="Gill Sans MT" w:hAnsi="Gill Sans MT" w:cs="Tahoma"/>
-                              </w:rPr>
-                            </w:pPr>
-                            <w:r>
-                              <w:rPr>
-                                <w:rFonts w:ascii="Gill Sans MT" w:hAnsi="Gill Sans MT" w:cs="Tahoma"/>
-                              </w:rPr>
-                              <w:t>Chesterfield</w:t>
-                            </w:r>
-                            <w:r>
-                              <w:rPr>
-                                <w:rFonts w:ascii="Gill Sans MT" w:hAnsi="Gill Sans MT" w:cs="Tahoma"/>
-                              </w:rPr>
-                              <w:t>,</w:t>
-                            </w:r>
-                            <w:r>
-                              <w:rPr>
-                                <w:rFonts w:ascii="Gill Sans MT" w:hAnsi="Gill Sans MT" w:cs="Tahoma"/>
-                              </w:rPr>
-                              <w:t xml:space="preserve"> S43</w:t>
-                            </w:r>
-                            <w:r>
-                              <w:rPr>
-                                <w:rFonts w:ascii="Gill Sans MT" w:hAnsi="Gill Sans MT" w:cs="Tahoma"/>
-                              </w:rPr>
-                              <w:br/>
-                            </w:r>
-                          </w:p>
-                        </w:txbxContent>
-                      </wps:txbx>
-                      <wps:bodyPr rot="0" vert="horz" wrap="square" lIns="91440" tIns="45720" rIns="91440" bIns="45720" anchor="t" anchorCtr="0">
-                        <a:noAutofit/>
-                      </wps:bodyPr>
-                    </wps:wsp>
-                  </a:graphicData>
-                </a:graphic>
-                <wp14:sizeRelH relativeFrom="margin">
-                  <wp14:pctWidth>0</wp14:pctWidth>
-                </wp14:sizeRelH>
-                <wp14:sizeRelV relativeFrom="margin">
-                  <wp14:pctHeight>0</wp14:pctHeight>
-                </wp14:sizeRelV>
-              </wp:anchor>
-            </w:drawing>
-          </mc:Choice>
-          <mc:Fallback>
-            <w:pict>
-              <v:shape w14:anchorId="6537B1D2" id="_x0000_s1027" type="#_x0000_t202" style="position:absolute;margin-left:441.05pt;margin-top:37.5pt;width:91.5pt;height:18.5pt;z-index:251658240;visibility:visible;mso-wrap-style:square;mso-width-percent:0;mso-height-percent:0;mso-wrap-distance-left:9pt;mso-wrap-distance-top:0;mso-wrap-distance-right:9pt;mso-wrap-distance-bottom:0;mso-position-horizontal:absolute;mso-position-horizontal-relative:margin;mso-position-vertical:absolute;mso-position-vertical-relative:margin;mso-width-percent:0;mso-height-percent:0;mso-width-relative:margin;mso-height-relative:margin;v-text-anchor:top" o:gfxdata="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" filled="f" stroked="f">
-                <v:textbox>
-                  <w:txbxContent>
-                    <w:p>
-                      <w:pPr>
-                        <w:jc w:val="center"/>
-                        <w:rPr>
-                          <w:rFonts w:ascii="Gill Sans MT" w:hAnsi="Gill Sans MT" w:cs="Tahoma"/>
-                        </w:rPr>
-                      </w:pPr>
-                      <w:r>
-                        <w:rPr>
-                          <w:rFonts w:ascii="Gill Sans MT" w:hAnsi="Gill Sans MT" w:cs="Tahoma"/>
-                        </w:rPr>
-                        <w:t>Chesterfield</w:t>
-                      </w:r>
-                      <w:r>
-                        <w:rPr>
-                          <w:rFonts w:ascii="Gill Sans MT" w:hAnsi="Gill Sans MT" w:cs="Tahoma"/>
-                        </w:rPr>
-                        <w:t>,</w:t>
-                      </w:r>
-                      <w:r>
-                        <w:rPr>
-                          <w:rFonts w:ascii="Gill Sans MT" w:hAnsi="Gill Sans MT" w:cs="Tahoma"/>
-                        </w:rPr>
-                        <w:t xml:space="preserve"> S43</w:t>
-                      </w:r>
-                      <w:r>
-                        <w:rPr>
-                          <w:rFonts w:ascii="Gill Sans MT" w:hAnsi="Gill Sans MT" w:cs="Tahoma"/>
-                        </w:rPr>
-                        <w:br/>
-                      </w:r>
-                    </w:p>
-                  </w:txbxContent>
-                </v:textbox>
-                <w10:wrap anchorx="margin" anchory="margin"/>
-              </v:shape>
-            </w:pict>
-          </mc:Fallback>
-        </mc:AlternateContent>
-      </w:r>
-      <w:r>
-        <w:rPr>
-          <w:rFonts w:ascii="Gill Sans MT" w:hAnsi="Gill Sans MT" w:cs="Tahoma"/>
           <w:b/>
           <w:noProof/>
           <w:szCs w:val="20"/>
         </w:rPr>
         <w:drawing>
-          <wp:anchor distT="0" distB="0" distL="114300" distR="114300" simplePos="0" relativeHeight="251658248" behindDoc="0" locked="0" layoutInCell="1" allowOverlap="1" wp14:anchorId="172103F5" wp14:editId="71EDBD9C">
+          <wp:anchor distT="0" distB="0" distL="114300" distR="114300" simplePos="0" relativeHeight="251654144" behindDoc="0" locked="0" layoutInCell="1" allowOverlap="1" wp14:anchorId="172103F5" wp14:editId="051C3922">
             <wp:simplePos x="0" y="0"/>
             <wp:positionH relativeFrom="column">
-              <wp:posOffset>1200785</wp:posOffset>
+              <wp:posOffset>1162685</wp:posOffset>
             </wp:positionH>
             <wp:positionV relativeFrom="paragraph">
               <wp:posOffset>207645</wp:posOffset>
@@ -372,7 +408,7 @@
                     <pic:cNvPicPr/>
                   </pic:nvPicPr>
                   <pic:blipFill>
-                    <a:blip r:embed="rId9" cstate="print">
+                    <a:blip r:embed="rId11" cstate="print">
                       <a:extLst>
                         <a:ext uri="{28A0092B-C50C-407E-A947-70E740481C1C}">
                           <a14:useLocalDpi xmlns:a14="http://schemas.microsoft.com/office/drawing/2010/main" val="0"/>
@@ -402,17 +438,263 @@
         <w:rPr>
           <w:rFonts w:ascii="Gill Sans MT" w:hAnsi="Gill Sans MT" w:cs="Tahoma"/>
           <w:b/>
-          <w:bCs/>
           <w:noProof/>
           <w:szCs w:val="20"/>
+          <w:lang w:eastAsia="en-GB"/>
         </w:rPr>
         <mc:AlternateContent>
           <mc:Choice Requires="wps">
             <w:drawing>
-              <wp:anchor distT="45720" distB="45720" distL="114300" distR="114300" simplePos="0" relativeHeight="251658251" behindDoc="0" locked="0" layoutInCell="1" allowOverlap="1" wp14:anchorId="6EC0451C" wp14:editId="29F454EE">
+              <wp:anchor distT="0" distB="0" distL="114300" distR="114300" simplePos="0" relativeHeight="251641856" behindDoc="0" locked="0" layoutInCell="1" allowOverlap="1" wp14:anchorId="38EE8AEA" wp14:editId="2E7312B1">
                 <wp:simplePos x="0" y="0"/>
                 <wp:positionH relativeFrom="column">
-                  <wp:posOffset>148590</wp:posOffset>
+                  <wp:posOffset>-170180</wp:posOffset>
+                </wp:positionH>
+                <wp:positionV relativeFrom="paragraph">
+                  <wp:posOffset>163195</wp:posOffset>
+                </wp:positionV>
+                <wp:extent cx="2133600" cy="260350"/>
+                <wp:effectExtent l="0" t="0" r="0" b="6350"/>
+                <wp:wrapNone/>
+                <wp:docPr id="1" name="Text Box 2"/>
+                <wp:cNvGraphicFramePr>
+                  <a:graphicFrameLocks xmlns:a="http://schemas.openxmlformats.org/drawingml/2006/main"/>
+                </wp:cNvGraphicFramePr>
+                <a:graphic xmlns:a="http://schemas.openxmlformats.org/drawingml/2006/main">
+                  <a:graphicData uri="http://schemas.microsoft.com/office/word/2010/wordprocessingShape">
+                    <wps:wsp>
+                      <wps:cNvSpPr txBox="1">
+                        <a:spLocks noChangeArrowheads="1"/>
+                      </wps:cNvSpPr>
+                      <wps:spPr bwMode="auto">
+                        <a:xfrm>
+                          <a:off x="0" y="0"/>
+                          <a:ext cx="2133600" cy="260350"/>
+                        </a:xfrm>
+                        <a:prstGeom prst="rect">
+                          <a:avLst/>
+                        </a:prstGeom>
+                        <a:noFill/>
+                        <a:ln w="9525">
+                          <a:noFill/>
+                          <a:miter lim="800000"/>
+                          <a:headEnd/>
+                          <a:tailEnd/>
+                        </a:ln>
+                      </wps:spPr>
+                      <wps:txbx>
+                        <w:txbxContent>
+                          <w:p>
+                            <w:pPr>
+                              <w:jc w:val="center"/>
+                              <w:rPr>
+                                <w:rFonts w:ascii="Gill Sans MT" w:hAnsi="Gill Sans MT" w:cs="Tahoma"/>
+                                <w14:textOutline w14:w="9525" w14:cap="rnd" w14:cmpd="sng" w14:algn="ctr">
+                                  <w14:noFill/>
+                                  <w14:prstDash w14:val="solid"/>
+                                  <w14:bevel/>
+                                </w14:textOutline>
+                              </w:rPr>
+                            </w:pPr>
+                            <w:hyperlink r:id="rId12" w:history="1">
+                              <w:r>
+                                <w:rPr>
+                                  <w:rStyle w:val="Hyperlink"/>
+                                  <w:rFonts w:ascii="Gill Sans MT" w:hAnsi="Gill Sans MT" w:cs="Tahoma"/>
+                                  <w:b/>
+                                  <w:bCs/>
+                                  <w:u w:val="none"/>
+                                  <w14:textOutline w14:w="9525" w14:cap="rnd" w14:cmpd="sng" w14:algn="ctr">
+                                    <w14:noFill/>
+                                    <w14:prstDash w14:val="solid"/>
+                                    <w14:bevel/>
+                                  </w14:textOutline>
+                                </w:rPr>
+                                <w:t>linkedin.com/in/ashleydgibson</w:t>
+                              </w:r>
+                            </w:hyperlink>
+                            <w:r>
+                              <w:rPr>
+                                <w:rFonts w:ascii="Gill Sans MT" w:hAnsi="Gill Sans MT" w:cs="Tahoma"/>
+                                <w14:textOutline w14:w="9525" w14:cap="rnd" w14:cmpd="sng" w14:algn="ctr">
+                                  <w14:noFill/>
+                                  <w14:prstDash w14:val="solid"/>
+                                  <w14:bevel/>
+                                </w14:textOutline>
+                              </w:rPr>
+                              <w:br/>
+                            </w:r>
+                          </w:p>
+                          <w:p>
+                            <w:pPr>
+                              <w:jc w:val="center"/>
+                              <w:rPr>
+                                <w:rFonts w:ascii="Tahoma" w:hAnsi="Tahoma" w:cs="Tahoma"/>
+                                <w:sz w:val="20"/>
+                                <w14:textOutline w14:w="9525" w14:cap="rnd" w14:cmpd="sng" w14:algn="ctr">
+                                  <w14:noFill/>
+                                  <w14:prstDash w14:val="solid"/>
+                                  <w14:bevel/>
+                                </w14:textOutline>
+                              </w:rPr>
+                            </w:pPr>
+                          </w:p>
+                        </w:txbxContent>
+                      </wps:txbx>
+                      <wps:bodyPr rot="0" vert="horz" wrap="square" lIns="91440" tIns="45720" rIns="91440" bIns="45720" anchor="t" anchorCtr="0">
+                        <a:noAutofit/>
+                      </wps:bodyPr>
+                    </wps:wsp>
+                  </a:graphicData>
+                </a:graphic>
+                <wp14:sizeRelH relativeFrom="margin">
+                  <wp14:pctWidth>0</wp14:pctWidth>
+                </wp14:sizeRelH>
+                <wp14:sizeRelV relativeFrom="margin">
+                  <wp14:pctHeight>0</wp14:pctHeight>
+                </wp14:sizeRelV>
+              </wp:anchor>
+            </w:drawing>
+          </mc:Choice>
+          <mc:Fallback>
+            <w:pict>
+              <v:shape w14:anchorId="38EE8AEA" id="_x0000_s1028" type="#_x0000_t202" style="position:absolute;margin-left:-13.4pt;margin-top:12.85pt;width:168pt;height:20.5pt;z-index:251641856;visibility:visible;mso-wrap-style:square;mso-width-percent:0;mso-height-percent:0;mso-wrap-distance-left:9pt;mso-wrap-distance-top:0;mso-wrap-distance-right:9pt;mso-wrap-distance-bottom:0;mso-position-horizontal:absolute;mso-position-horizontal-relative:text;mso-position-vertical:absolute;mso-position-vertical-relative:text;mso-width-percent:0;mso-height-percent:0;mso-width-relative:margin;mso-height-relative:margin;v-text-anchor:top" o:gfxdata="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" filled="f" stroked="f">
+                <v:textbox>
+                  <w:txbxContent>
+                    <w:p>
+                      <w:pPr>
+                        <w:jc w:val="center"/>
+                        <w:rPr>
+                          <w:rFonts w:ascii="Gill Sans MT" w:hAnsi="Gill Sans MT" w:cs="Tahoma"/>
+                          <w14:textOutline w14:w="9525" w14:cap="rnd" w14:cmpd="sng" w14:algn="ctr">
+                            <w14:noFill/>
+                            <w14:prstDash w14:val="solid"/>
+                            <w14:bevel/>
+                          </w14:textOutline>
+                        </w:rPr>
+                      </w:pPr>
+                      <w:hyperlink r:id="rId13" w:history="1">
+                        <w:r>
+                          <w:rPr>
+                            <w:rStyle w:val="Hyperlink"/>
+                            <w:rFonts w:ascii="Gill Sans MT" w:hAnsi="Gill Sans MT" w:cs="Tahoma"/>
+                            <w:b/>
+                            <w:bCs/>
+                            <w:u w:val="none"/>
+                            <w14:textOutline w14:w="9525" w14:cap="rnd" w14:cmpd="sng" w14:algn="ctr">
+                              <w14:noFill/>
+                              <w14:prstDash w14:val="solid"/>
+                              <w14:bevel/>
+                            </w14:textOutline>
+                          </w:rPr>
+                          <w:t>linkedin.com/in/ashleydgibson</w:t>
+                        </w:r>
+                      </w:hyperlink>
+                      <w:r>
+                        <w:rPr>
+                          <w:rFonts w:ascii="Gill Sans MT" w:hAnsi="Gill Sans MT" w:cs="Tahoma"/>
+                          <w14:textOutline w14:w="9525" w14:cap="rnd" w14:cmpd="sng" w14:algn="ctr">
+                            <w14:noFill/>
+                            <w14:prstDash w14:val="solid"/>
+                            <w14:bevel/>
+                          </w14:textOutline>
+                        </w:rPr>
+                        <w:br/>
+                      </w:r>
+                    </w:p>
+                    <w:p>
+                      <w:pPr>
+                        <w:jc w:val="center"/>
+                        <w:rPr>
+                          <w:rFonts w:ascii="Tahoma" w:hAnsi="Tahoma" w:cs="Tahoma"/>
+                          <w:sz w:val="20"/>
+                          <w14:textOutline w14:w="9525" w14:cap="rnd" w14:cmpd="sng" w14:algn="ctr">
+                            <w14:noFill/>
+                            <w14:prstDash w14:val="solid"/>
+                            <w14:bevel/>
+                          </w14:textOutline>
+                        </w:rPr>
+                      </w:pPr>
+                    </w:p>
+                  </w:txbxContent>
+                </v:textbox>
+              </v:shape>
+            </w:pict>
+          </mc:Fallback>
+        </mc:AlternateContent>
+      </w:r>
+      <w:r>
+        <w:rPr>
+          <w:rFonts w:ascii="Gill Sans MT" w:hAnsi="Gill Sans MT" w:cs="Tahoma"/>
+          <w:b/>
+          <w:noProof/>
+          <w:szCs w:val="20"/>
+        </w:rPr>
+        <w:drawing>
+          <wp:anchor distT="0" distB="0" distL="114300" distR="114300" simplePos="0" relativeHeight="251661312" behindDoc="0" locked="0" layoutInCell="1" allowOverlap="1" wp14:anchorId="54F0E12B" wp14:editId="40205D05">
+            <wp:simplePos x="0" y="0"/>
+            <wp:positionH relativeFrom="column">
+              <wp:posOffset>3156585</wp:posOffset>
+            </wp:positionH>
+            <wp:positionV relativeFrom="paragraph">
+              <wp:posOffset>201295</wp:posOffset>
+            </wp:positionV>
+            <wp:extent cx="179705" cy="179705"/>
+            <wp:effectExtent l="0" t="0" r="0" b="0"/>
+            <wp:wrapSquare wrapText="bothSides"/>
+            <wp:docPr id="8" name="Picture 8" descr="Shape&#10;&#10;Description automatically generated with low confidence"/>
+            <wp:cNvGraphicFramePr>
+              <a:graphicFrameLocks xmlns:a="http://schemas.openxmlformats.org/drawingml/2006/main" noChangeAspect="1"/>
+            </wp:cNvGraphicFramePr>
+            <a:graphic xmlns:a="http://schemas.openxmlformats.org/drawingml/2006/main">
+              <a:graphicData uri="http://schemas.openxmlformats.org/drawingml/2006/picture">
+                <pic:pic xmlns:pic="http://schemas.openxmlformats.org/drawingml/2006/picture">
+                  <pic:nvPicPr>
+                    <pic:cNvPr id="8" name="Picture 8" descr="Shape&#10;&#10;Description automatically generated with low confidence"/>
+                    <pic:cNvPicPr/>
+                  </pic:nvPicPr>
+                  <pic:blipFill>
+                    <a:blip r:embed="rId14" cstate="print">
+                      <a:extLst>
+                        <a:ext uri="{28A0092B-C50C-407E-A947-70E740481C1C}">
+                          <a14:useLocalDpi xmlns:a14="http://schemas.microsoft.com/office/drawing/2010/main" val="0"/>
+                        </a:ext>
+                      </a:extLst>
+                    </a:blip>
+                    <a:stretch>
+                      <a:fillRect/>
+                    </a:stretch>
+                  </pic:blipFill>
+                  <pic:spPr>
+                    <a:xfrm>
+                      <a:off x="0" y="0"/>
+                      <a:ext cx="179705" cy="179705"/>
+                    </a:xfrm>
+                    <a:prstGeom prst="rect">
+                      <a:avLst/>
+                    </a:prstGeom>
+                  </pic:spPr>
+                </pic:pic>
+              </a:graphicData>
+            </a:graphic>
+          </wp:anchor>
+        </w:drawing>
+      </w:r>
+      <w:r>
+        <w:rPr>
+          <w:rFonts w:ascii="Gill Sans MT" w:hAnsi="Gill Sans MT" w:cs="Tahoma"/>
+          <w:b/>
+          <w:bCs/>
+          <w:noProof/>
+          <w:szCs w:val="20"/>
+        </w:rPr>
+        <mc:AlternateContent>
+          <mc:Choice Requires="wps">
+            <w:drawing>
+              <wp:anchor distT="45720" distB="45720" distL="114300" distR="114300" simplePos="0" relativeHeight="251682816" behindDoc="0" locked="0" layoutInCell="1" allowOverlap="1" wp14:anchorId="6EC0451C" wp14:editId="05D34291">
+                <wp:simplePos x="0" y="0"/>
+                <wp:positionH relativeFrom="column">
+                  <wp:posOffset>129540</wp:posOffset>
                 </wp:positionH>
                 <wp:positionV relativeFrom="paragraph">
                   <wp:posOffset>156845</wp:posOffset>
@@ -493,7 +775,7 @@
           </mc:Choice>
           <mc:Fallback>
             <w:pict>
-              <v:shape w14:anchorId="6EC0451C" id="_x0000_s1028" type="#_x0000_t202" style="position:absolute;margin-left:11.7pt;margin-top:12.35pt;width:83pt;height:19pt;z-index:251658251;visibility:visible;mso-wrap-style:square;mso-width-percent:0;mso-height-percent:0;mso-wrap-distance-left:9pt;mso-wrap-distance-top:3.6pt;mso-wrap-distance-right:9pt;mso-wrap-distance-bottom:3.6pt;mso-position-horizontal:absolute;mso-position-horizontal-relative:text;mso-position-vertical:absolute;mso-position-vertical-relative:text;mso-width-percent:0;mso-height-percent:0;mso-width-relative:margin;mso-height-relative:margin;v-text-anchor:top" o:gfxdata="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" filled="f" stroked="f">
+              <v:shape w14:anchorId="6EC0451C" id="_x0000_s1029" type="#_x0000_t202" style="position:absolute;margin-left:10.2pt;margin-top:12.35pt;width:83pt;height:19pt;z-index:251682816;visibility:visible;mso-wrap-style:square;mso-width-percent:0;mso-height-percent:0;mso-wrap-distance-left:9pt;mso-wrap-distance-top:3.6pt;mso-wrap-distance-right:9pt;mso-wrap-distance-bottom:3.6pt;mso-position-horizontal:absolute;mso-position-horizontal-relative:text;mso-position-vertical:absolute;mso-position-vertical-relative:text;mso-width-percent:0;mso-height-percent:0;mso-width-relative:margin;mso-height-relative:margin;v-text-anchor:top" o:gfxdata="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" filled="f" stroked="f">
                 <v:textbox>
                   <w:txbxContent>
                     <w:p>
@@ -534,63 +816,6 @@
         <w:rPr>
           <w:rFonts w:ascii="Gill Sans MT" w:hAnsi="Gill Sans MT" w:cs="Tahoma"/>
           <w:b/>
-          <w:noProof/>
-          <w:szCs w:val="20"/>
-        </w:rPr>
-        <w:drawing>
-          <wp:anchor distT="0" distB="0" distL="114300" distR="114300" simplePos="0" relativeHeight="251658249" behindDoc="0" locked="0" layoutInCell="1" allowOverlap="1" wp14:anchorId="54F0E12B" wp14:editId="3A2C4521">
-            <wp:simplePos x="0" y="0"/>
-            <wp:positionH relativeFrom="column">
-              <wp:posOffset>3232785</wp:posOffset>
-            </wp:positionH>
-            <wp:positionV relativeFrom="paragraph">
-              <wp:posOffset>201295</wp:posOffset>
-            </wp:positionV>
-            <wp:extent cx="179705" cy="179705"/>
-            <wp:effectExtent l="0" t="0" r="0" b="0"/>
-            <wp:wrapSquare wrapText="bothSides"/>
-            <wp:docPr id="8" name="Picture 8" descr="Shape&#10;&#10;Description automatically generated with low confidence"/>
-            <wp:cNvGraphicFramePr>
-              <a:graphicFrameLocks xmlns:a="http://schemas.openxmlformats.org/drawingml/2006/main" noChangeAspect="1"/>
-            </wp:cNvGraphicFramePr>
-            <a:graphic xmlns:a="http://schemas.openxmlformats.org/drawingml/2006/main">
-              <a:graphicData uri="http://schemas.openxmlformats.org/drawingml/2006/picture">
-                <pic:pic xmlns:pic="http://schemas.openxmlformats.org/drawingml/2006/picture">
-                  <pic:nvPicPr>
-                    <pic:cNvPr id="8" name="Picture 8" descr="Shape&#10;&#10;Description automatically generated with low confidence"/>
-                    <pic:cNvPicPr/>
-                  </pic:nvPicPr>
-                  <pic:blipFill>
-                    <a:blip r:embed="rId10" cstate="print">
-                      <a:extLst>
-                        <a:ext uri="{28A0092B-C50C-407E-A947-70E740481C1C}">
-                          <a14:useLocalDpi xmlns:a14="http://schemas.microsoft.com/office/drawing/2010/main" val="0"/>
-                        </a:ext>
-                      </a:extLst>
-                    </a:blip>
-                    <a:stretch>
-                      <a:fillRect/>
-                    </a:stretch>
-                  </pic:blipFill>
-                  <pic:spPr>
-                    <a:xfrm>
-                      <a:off x="0" y="0"/>
-                      <a:ext cx="179705" cy="179705"/>
-                    </a:xfrm>
-                    <a:prstGeom prst="rect">
-                      <a:avLst/>
-                    </a:prstGeom>
-                  </pic:spPr>
-                </pic:pic>
-              </a:graphicData>
-            </a:graphic>
-          </wp:anchor>
-        </w:drawing>
-      </w:r>
-      <w:r>
-        <w:rPr>
-          <w:rFonts w:ascii="Gill Sans MT" w:hAnsi="Gill Sans MT" w:cs="Tahoma"/>
-          <w:b/>
           <w:bCs/>
           <w:noProof/>
           <w:szCs w:val="20"/>
@@ -598,10 +823,10 @@
         <mc:AlternateContent>
           <mc:Choice Requires="wps">
             <w:drawing>
-              <wp:anchor distT="45720" distB="45720" distL="114300" distR="114300" simplePos="0" relativeHeight="251658252" behindDoc="0" locked="0" layoutInCell="1" allowOverlap="1" wp14:anchorId="215261B3" wp14:editId="6AD68CC7">
+              <wp:anchor distT="45720" distB="45720" distL="114300" distR="114300" simplePos="0" relativeHeight="251693056" behindDoc="0" locked="0" layoutInCell="1" allowOverlap="1" wp14:anchorId="215261B3" wp14:editId="31A905F5">
                 <wp:simplePos x="0" y="0"/>
                 <wp:positionH relativeFrom="column">
-                  <wp:posOffset>1359535</wp:posOffset>
+                  <wp:posOffset>1292860</wp:posOffset>
                 </wp:positionH>
                 <wp:positionV relativeFrom="paragraph">
                   <wp:posOffset>156845</wp:posOffset>
@@ -647,7 +872,7 @@
                                 </w14:textOutline>
                               </w:rPr>
                             </w:pPr>
-                            <w:hyperlink r:id="rId11" w:history="1">
+                            <w:hyperlink r:id="rId15" w:history="1">
                               <w:r>
                                 <w:rPr>
                                   <w:rStyle w:val="Hyperlink"/>
@@ -684,7 +909,7 @@
           </mc:Choice>
           <mc:Fallback>
             <w:pict>
-              <v:shape w14:anchorId="215261B3" id="_x0000_s1029" type="#_x0000_t202" style="position:absolute;margin-left:107.05pt;margin-top:12.35pt;width:150pt;height:20.5pt;z-index:251658252;visibility:visible;mso-wrap-style:square;mso-width-percent:0;mso-height-percent:0;mso-wrap-distance-left:9pt;mso-wrap-distance-top:3.6pt;mso-wrap-distance-right:9pt;mso-wrap-distance-bottom:3.6pt;mso-position-horizontal:absolute;mso-position-horizontal-relative:text;mso-position-vertical:absolute;mso-position-vertical-relative:text;mso-width-percent:0;mso-height-percent:0;mso-width-relative:margin;mso-height-relative:margin;v-text-anchor:top" o:gfxdata="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" filled="f" stroked="f">
+              <v:shape w14:anchorId="215261B3" id="_x0000_s1030" type="#_x0000_t202" style="position:absolute;margin-left:101.8pt;margin-top:12.35pt;width:150pt;height:20.5pt;z-index:251693056;visibility:visible;mso-wrap-style:square;mso-width-percent:0;mso-height-percent:0;mso-wrap-distance-left:9pt;mso-wrap-distance-top:3.6pt;mso-wrap-distance-right:9pt;mso-wrap-distance-bottom:3.6pt;mso-position-horizontal:absolute;mso-position-horizontal-relative:text;mso-position-vertical:absolute;mso-position-vertical-relative:text;mso-width-percent:0;mso-height-percent:0;mso-width-relative:margin;mso-height-relative:margin;v-text-anchor:top" o:gfxdata="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" filled="f" stroked="f">
                 <v:textbox>
                   <w:txbxContent>
                     <w:p>
@@ -697,7 +922,7 @@
                           </w14:textOutline>
                         </w:rPr>
                       </w:pPr>
-                      <w:hyperlink r:id="rId12" w:history="1">
+                      <w:hyperlink r:id="rId16" w:history="1">
                         <w:r>
                           <w:rPr>
                             <w:rStyle w:val="Hyperlink"/>
@@ -726,195 +951,6 @@
       <w:r>
         <w:rPr>
           <w:rFonts w:ascii="Gill Sans MT" w:hAnsi="Gill Sans MT" w:cs="Tahoma"/>
-          <w:b/>
-          <w:noProof/>
-          <w:szCs w:val="20"/>
-          <w:lang w:eastAsia="en-GB"/>
-        </w:rPr>
-        <mc:AlternateContent>
-          <mc:Choice Requires="wps">
-            <w:drawing>
-              <wp:anchor distT="0" distB="0" distL="114300" distR="114300" simplePos="0" relativeHeight="251658241" behindDoc="0" locked="0" layoutInCell="1" allowOverlap="1" wp14:anchorId="38EE8AEA" wp14:editId="2AB5AFF2">
-                <wp:simplePos x="0" y="0"/>
-                <wp:positionH relativeFrom="column">
-                  <wp:posOffset>-122555</wp:posOffset>
-                </wp:positionH>
-                <wp:positionV relativeFrom="paragraph">
-                  <wp:posOffset>163195</wp:posOffset>
-                </wp:positionV>
-                <wp:extent cx="2133600" cy="260350"/>
-                <wp:effectExtent l="0" t="0" r="0" b="6350"/>
-                <wp:wrapNone/>
-                <wp:docPr id="1" name="Text Box 2"/>
-                <wp:cNvGraphicFramePr>
-                  <a:graphicFrameLocks xmlns:a="http://schemas.openxmlformats.org/drawingml/2006/main"/>
-                </wp:cNvGraphicFramePr>
-                <a:graphic xmlns:a="http://schemas.openxmlformats.org/drawingml/2006/main">
-                  <a:graphicData uri="http://schemas.microsoft.com/office/word/2010/wordprocessingShape">
-                    <wps:wsp>
-                      <wps:cNvSpPr txBox="1">
-                        <a:spLocks noChangeArrowheads="1"/>
-                      </wps:cNvSpPr>
-                      <wps:spPr bwMode="auto">
-                        <a:xfrm>
-                          <a:off x="0" y="0"/>
-                          <a:ext cx="2133600" cy="260350"/>
-                        </a:xfrm>
-                        <a:prstGeom prst="rect">
-                          <a:avLst/>
-                        </a:prstGeom>
-                        <a:noFill/>
-                        <a:ln w="9525">
-                          <a:noFill/>
-                          <a:miter lim="800000"/>
-                          <a:headEnd/>
-                          <a:tailEnd/>
-                        </a:ln>
-                      </wps:spPr>
-                      <wps:txbx>
-                        <w:txbxContent>
-                          <w:p>
-                            <w:pPr>
-                              <w:jc w:val="center"/>
-                              <w:rPr>
-                                <w:rFonts w:ascii="Gill Sans MT" w:hAnsi="Gill Sans MT" w:cs="Tahoma"/>
-                                <w14:textOutline w14:w="9525" w14:cap="rnd" w14:cmpd="sng" w14:algn="ctr">
-                                  <w14:noFill/>
-                                  <w14:prstDash w14:val="solid"/>
-                                  <w14:bevel/>
-                                </w14:textOutline>
-                              </w:rPr>
-                            </w:pPr>
-                            <w:hyperlink r:id="rId13" w:history="1">
-                              <w:r>
-                                <w:rPr>
-                                  <w:rStyle w:val="Hyperlink"/>
-                                  <w:rFonts w:ascii="Gill Sans MT" w:hAnsi="Gill Sans MT" w:cs="Tahoma"/>
-                                  <w:b/>
-                                  <w:bCs/>
-                                  <w:u w:val="none"/>
-                                  <w14:textOutline w14:w="9525" w14:cap="rnd" w14:cmpd="sng" w14:algn="ctr">
-                                    <w14:noFill/>
-                                    <w14:prstDash w14:val="solid"/>
-                                    <w14:bevel/>
-                                  </w14:textOutline>
-                                </w:rPr>
-                                <w:t>linkedin.com/in/ashleydgibson</w:t>
-                              </w:r>
-                            </w:hyperlink>
-                            <w:r>
-                              <w:rPr>
-                                <w:rFonts w:ascii="Gill Sans MT" w:hAnsi="Gill Sans MT" w:cs="Tahoma"/>
-                                <w14:textOutline w14:w="9525" w14:cap="rnd" w14:cmpd="sng" w14:algn="ctr">
-                                  <w14:noFill/>
-                                  <w14:prstDash w14:val="solid"/>
-                                  <w14:bevel/>
-                                </w14:textOutline>
-                              </w:rPr>
-                              <w:br/>
-                            </w:r>
-                          </w:p>
-                          <w:p>
-                            <w:pPr>
-                              <w:jc w:val="center"/>
-                              <w:rPr>
-                                <w:rFonts w:ascii="Tahoma" w:hAnsi="Tahoma" w:cs="Tahoma"/>
-                                <w:sz w:val="20"/>
-                                <w14:textOutline w14:w="9525" w14:cap="rnd" w14:cmpd="sng" w14:algn="ctr">
-                                  <w14:noFill/>
-                                  <w14:prstDash w14:val="solid"/>
-                                  <w14:bevel/>
-                                </w14:textOutline>
-                              </w:rPr>
-                            </w:pPr>
-                          </w:p>
-                        </w:txbxContent>
-                      </wps:txbx>
-                      <wps:bodyPr rot="0" vert="horz" wrap="square" lIns="91440" tIns="45720" rIns="91440" bIns="45720" anchor="t" anchorCtr="0">
-                        <a:noAutofit/>
-                      </wps:bodyPr>
-                    </wps:wsp>
-                  </a:graphicData>
-                </a:graphic>
-                <wp14:sizeRelH relativeFrom="margin">
-                  <wp14:pctWidth>0</wp14:pctWidth>
-                </wp14:sizeRelH>
-                <wp14:sizeRelV relativeFrom="margin">
-                  <wp14:pctHeight>0</wp14:pctHeight>
-                </wp14:sizeRelV>
-              </wp:anchor>
-            </w:drawing>
-          </mc:Choice>
-          <mc:Fallback>
-            <w:pict>
-              <v:shape w14:anchorId="38EE8AEA" id="_x0000_s1030" type="#_x0000_t202" style="position:absolute;margin-left:-9.65pt;margin-top:12.85pt;width:168pt;height:20.5pt;z-index:251658241;visibility:visible;mso-wrap-style:square;mso-width-percent:0;mso-height-percent:0;mso-wrap-distance-left:9pt;mso-wrap-distance-top:0;mso-wrap-distance-right:9pt;mso-wrap-distance-bottom:0;mso-position-horizontal:absolute;mso-position-horizontal-relative:text;mso-position-vertical:absolute;mso-position-vertical-relative:text;mso-width-percent:0;mso-height-percent:0;mso-width-relative:margin;mso-height-relative:margin;v-text-anchor:top" o:gfxdata="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" filled="f" stroked="f">
-                <v:textbox>
-                  <w:txbxContent>
-                    <w:p>
-                      <w:pPr>
-                        <w:jc w:val="center"/>
-                        <w:rPr>
-                          <w:rFonts w:ascii="Gill Sans MT" w:hAnsi="Gill Sans MT" w:cs="Tahoma"/>
-                          <w14:textOutline w14:w="9525" w14:cap="rnd" w14:cmpd="sng" w14:algn="ctr">
-                            <w14:noFill/>
-                            <w14:prstDash w14:val="solid"/>
-                            <w14:bevel/>
-                          </w14:textOutline>
-                        </w:rPr>
-                      </w:pPr>
-                      <w:hyperlink r:id="rId14" w:history="1">
-                        <w:r>
-                          <w:rPr>
-                            <w:rStyle w:val="Hyperlink"/>
-                            <w:rFonts w:ascii="Gill Sans MT" w:hAnsi="Gill Sans MT" w:cs="Tahoma"/>
-                            <w:b/>
-                            <w:bCs/>
-                            <w:u w:val="none"/>
-                            <w14:textOutline w14:w="9525" w14:cap="rnd" w14:cmpd="sng" w14:algn="ctr">
-                              <w14:noFill/>
-                              <w14:prstDash w14:val="solid"/>
-                              <w14:bevel/>
-                            </w14:textOutline>
-                          </w:rPr>
-                          <w:t>linkedin.com/in/ashleydgibson</w:t>
-                        </w:r>
-                      </w:hyperlink>
-                      <w:r>
-                        <w:rPr>
-                          <w:rFonts w:ascii="Gill Sans MT" w:hAnsi="Gill Sans MT" w:cs="Tahoma"/>
-                          <w14:textOutline w14:w="9525" w14:cap="rnd" w14:cmpd="sng" w14:algn="ctr">
-                            <w14:noFill/>
-                            <w14:prstDash w14:val="solid"/>
-                            <w14:bevel/>
-                          </w14:textOutline>
-                        </w:rPr>
-                        <w:br/>
-                      </w:r>
-                    </w:p>
-                    <w:p>
-                      <w:pPr>
-                        <w:jc w:val="center"/>
-                        <w:rPr>
-                          <w:rFonts w:ascii="Tahoma" w:hAnsi="Tahoma" w:cs="Tahoma"/>
-                          <w:sz w:val="20"/>
-                          <w14:textOutline w14:w="9525" w14:cap="rnd" w14:cmpd="sng" w14:algn="ctr">
-                            <w14:noFill/>
-                            <w14:prstDash w14:val="solid"/>
-                            <w14:bevel/>
-                          </w14:textOutline>
-                        </w:rPr>
-                      </w:pPr>
-                    </w:p>
-                  </w:txbxContent>
-                </v:textbox>
-              </v:shape>
-            </w:pict>
-          </mc:Fallback>
-        </mc:AlternateContent>
-      </w:r>
-      <w:r>
-        <w:rPr>
-          <w:rFonts w:ascii="Gill Sans MT" w:hAnsi="Gill Sans MT" w:cs="Tahoma"/>
           <w:noProof/>
         </w:rPr>
         <w:drawing>
@@ -941,7 +977,7 @@
                     <pic:cNvPicPr/>
                   </pic:nvPicPr>
                   <pic:blipFill>
-                    <a:blip r:embed="rId15" cstate="print">
+                    <a:blip r:embed="rId17" cstate="print">
                       <a:extLst>
                         <a:ext uri="{28A0092B-C50C-407E-A947-70E740481C1C}">
                           <a14:useLocalDpi xmlns:a14="http://schemas.microsoft.com/office/drawing/2010/main" val="0"/>
@@ -1073,19 +1109,7 @@
         <w:rPr>
           <w:rFonts w:ascii="Gill Sans MT" w:hAnsi="Gill Sans MT" w:cs="Tahoma"/>
         </w:rPr>
-        <w:t>and I</w:t>
-      </w:r>
-      <w:r>
-        <w:rPr>
-          <w:rFonts w:ascii="Gill Sans MT" w:hAnsi="Gill Sans MT" w:cs="Tahoma"/>
-        </w:rPr>
-        <w:t xml:space="preserve"> a</w:t>
-      </w:r>
-      <w:r>
-        <w:rPr>
-          <w:rFonts w:ascii="Gill Sans MT" w:hAnsi="Gill Sans MT" w:cs="Tahoma"/>
-        </w:rPr>
-        <w:t xml:space="preserve">m ready to integrate with a fast-paced </w:t>
+        <w:t xml:space="preserve">and ready to integrate with a fast-paced </w:t>
       </w:r>
       <w:r>
         <w:rPr>
@@ -1120,6 +1144,12 @@
       <w:r>
         <w:rPr>
           <w:rFonts w:ascii="Gill Sans MT" w:hAnsi="Gill Sans MT" w:cs="Tahoma"/>
+        </w:rPr>
+        <w:t xml:space="preserve"> I have experience working in both Product and Platform Operating Models.</w:t>
+      </w:r>
+      <w:r>
+        <w:rPr>
+          <w:rFonts w:ascii="Gill Sans MT" w:hAnsi="Gill Sans MT" w:cs="Tahoma"/>
           <w:szCs w:val="20"/>
         </w:rPr>
         <w:br/>
@@ -1136,7 +1166,7 @@
         </w:rPr>
         <w:t xml:space="preserve">: </w:t>
       </w:r>
-      <w:hyperlink r:id="rId16" w:history="1">
+      <w:hyperlink r:id="rId18" w:history="1">
         <w:r>
           <w:rPr>
             <w:rStyle w:val="Hyperlink"/>
@@ -1169,7 +1199,7 @@
         </w:rPr>
         <w:t xml:space="preserve">GitHub: </w:t>
       </w:r>
-      <w:hyperlink r:id="rId17" w:history="1">
+      <w:hyperlink r:id="rId19" w:history="1">
         <w:r>
           <w:rPr>
             <w:rStyle w:val="Hyperlink"/>
@@ -1195,13 +1225,6 @@
           <w:noProof/>
           <w:szCs w:val="20"/>
         </w:rPr>
-      </w:r>
-      <w:r>
-        <w:rPr>
-          <w:rFonts w:ascii="Gill Sans MT" w:hAnsi="Gill Sans MT" w:cs="Tahoma"/>
-          <w:noProof/>
-          <w:szCs w:val="20"/>
-        </w:rPr>
         <w:pict w14:anchorId="27539CC3">
           <v:rect id="_x0000_i1025" style="width:451.3pt;height:2pt;mso-position-vertical:absolute" o:hralign="center" o:hrstd="t" o:hrnoshade="t" o:hr="t" fillcolor="black [3213]" stroked="f"/>
         </w:pict>
@@ -1237,7 +1260,7 @@
           <w:szCs w:val="20"/>
         </w:rPr>
       </w:pPr>
-      <w:hyperlink r:id="rId18" w:history="1">
+      <w:hyperlink r:id="rId20" w:history="1">
         <w:r>
           <w:rPr>
             <w:rStyle w:val="Hyperlink"/>
@@ -1268,7 +1291,7 @@
         </w:rPr>
         <w:br/>
       </w:r>
-      <w:hyperlink r:id="rId19" w:history="1">
+      <w:hyperlink r:id="rId21" w:history="1">
         <w:r>
           <w:rPr>
             <w:rStyle w:val="Hyperlink"/>
@@ -1447,7 +1470,21 @@
           <w:rFonts w:ascii="Gill Sans MT" w:hAnsi="Gill Sans MT" w:cs="Tahoma"/>
           <w:szCs w:val="20"/>
         </w:rPr>
-        <w:t>Provisioned Azure Resources such as App Services, Function Apps, Key Vaults, App Insi</w:t>
+        <w:t xml:space="preserve">Provisioned Azure Resources such as App Services, Function Apps, </w:t>
+      </w:r>
+      <w:r>
+        <w:rPr>
+          <w:rFonts w:ascii="Gill Sans MT" w:hAnsi="Gill Sans MT" w:cs="Tahoma"/>
+          <w:szCs w:val="20"/>
+        </w:rPr>
+        <w:t xml:space="preserve">Service Buses, </w:t>
+      </w:r>
+      <w:r>
+        <w:rPr>
+          <w:rFonts w:ascii="Gill Sans MT" w:hAnsi="Gill Sans MT" w:cs="Tahoma"/>
+          <w:szCs w:val="20"/>
+        </w:rPr>
+        <w:t>Key Vaults, App Insi</w:t>
       </w:r>
       <w:r>
         <w:rPr>
@@ -1494,19 +1531,33 @@
         <w:rPr>
           <w:rFonts w:ascii="Gill Sans MT" w:hAnsi="Gill Sans MT" w:cs="Tahoma"/>
         </w:rPr>
-        <w:t>Securely built API's using WebAPI</w:t>
-      </w:r>
-      <w:r>
-        <w:rPr>
-          <w:rFonts w:ascii="Gill Sans MT" w:hAnsi="Gill Sans MT" w:cs="Tahoma"/>
-        </w:rPr>
-        <w:t xml:space="preserve"> and MediatR</w:t>
-      </w:r>
-      <w:r>
-        <w:rPr>
-          <w:rFonts w:ascii="Gill Sans MT" w:hAnsi="Gill Sans MT" w:cs="Tahoma"/>
-        </w:rPr>
-        <w:t xml:space="preserve"> for developing internal endpoints</w:t>
+        <w:t xml:space="preserve">Securely built API's using </w:t>
+      </w:r>
+      <w:proofErr w:type="spellStart"/>
+      <w:r>
+        <w:rPr>
+          <w:rFonts w:ascii="Gill Sans MT" w:hAnsi="Gill Sans MT" w:cs="Tahoma"/>
+        </w:rPr>
+        <w:t>WebAPI</w:t>
+      </w:r>
+      <w:proofErr w:type="spellEnd"/>
+      <w:r>
+        <w:rPr>
+          <w:rFonts w:ascii="Gill Sans MT" w:hAnsi="Gill Sans MT" w:cs="Tahoma"/>
+        </w:rPr>
+        <w:t xml:space="preserve"> </w:t>
+      </w:r>
+      <w:r>
+        <w:rPr>
+          <w:rFonts w:ascii="Gill Sans MT" w:hAnsi="Gill Sans MT" w:cs="Tahoma"/>
+        </w:rPr>
+        <w:t>for developing internal endpoints</w:t>
+      </w:r>
+      <w:r>
+        <w:rPr>
+          <w:rFonts w:ascii="Gill Sans MT" w:hAnsi="Gill Sans MT" w:cs="Tahoma"/>
+        </w:rPr>
+        <w:t xml:space="preserve"> on private virtual networks</w:t>
       </w:r>
     </w:p>
     <w:p>
@@ -1564,8 +1615,16 @@
         <w:rPr>
           <w:rFonts w:ascii="Gill Sans MT" w:hAnsi="Gill Sans MT" w:cs="Tahoma"/>
         </w:rPr>
-        <w:t>/xUnit</w:t>
-      </w:r>
+        <w:t>/</w:t>
+      </w:r>
+      <w:proofErr w:type="spellStart"/>
+      <w:r>
+        <w:rPr>
+          <w:rFonts w:ascii="Gill Sans MT" w:hAnsi="Gill Sans MT" w:cs="Tahoma"/>
+        </w:rPr>
+        <w:t>xUnit</w:t>
+      </w:r>
+      <w:proofErr w:type="spellEnd"/>
       <w:r>
         <w:rPr>
           <w:rFonts w:ascii="Gill Sans MT" w:hAnsi="Gill Sans MT" w:cs="Tahoma"/>
@@ -1610,21 +1669,7 @@
         <w:rPr>
           <w:rFonts w:ascii="Gill Sans MT" w:hAnsi="Gill Sans MT" w:cs="Tahoma"/>
         </w:rPr>
-        <w:t xml:space="preserve">for </w:t>
-      </w:r>
-      <w:proofErr w:type="spellStart"/>
-      <w:r>
-        <w:rPr>
-          <w:rFonts w:ascii="Gill Sans MT" w:hAnsi="Gill Sans MT" w:cs="Tahoma"/>
-        </w:rPr>
-        <w:t>Microservices</w:t>
-      </w:r>
-      <w:proofErr w:type="spellEnd"/>
-      <w:r>
-        <w:rPr>
-          <w:rFonts w:ascii="Gill Sans MT" w:hAnsi="Gill Sans MT" w:cs="Tahoma"/>
-        </w:rPr>
-        <w:t xml:space="preserve"> and Database mocking</w:t>
+        <w:t>for Microservices and Database mocking</w:t>
       </w:r>
     </w:p>
     <w:p>
@@ -1790,7 +1835,7 @@
           <w:szCs w:val="20"/>
         </w:rPr>
       </w:pPr>
-      <w:hyperlink r:id="rId20" w:history="1">
+      <w:hyperlink r:id="rId22" w:history="1">
         <w:r>
           <w:rPr>
             <w:rStyle w:val="Hyperlink"/>
@@ -2185,7 +2230,7 @@
           <w:szCs w:val="20"/>
         </w:rPr>
       </w:pPr>
-      <w:hyperlink r:id="rId21" w:history="1">
+      <w:hyperlink r:id="rId23" w:history="1">
         <w:r>
           <w:rPr>
             <w:rStyle w:val="Hyperlink"/>
@@ -2559,7 +2604,7 @@
           <w:szCs w:val="20"/>
         </w:rPr>
       </w:pPr>
-      <w:hyperlink r:id="rId22" w:history="1">
+      <w:hyperlink r:id="rId24" w:history="1">
         <w:r>
           <w:rPr>
             <w:rStyle w:val="Hyperlink"/>
@@ -2723,28 +2768,37 @@
         </w:rPr>
         <w:t>Produced Release Notes, Bug Logs and other documentation records for both End Users and internal developers</w:t>
       </w:r>
-    </w:p>
-    <w:p>
-      <w:pPr>
-        <w:pStyle w:val="ListParagraph"/>
-        <w:numPr>
-          <w:ilvl w:val="0"/>
-          <w:numId w:val="5"/>
-        </w:numPr>
-        <w:rPr>
-          <w:rFonts w:ascii="Gill Sans MT" w:hAnsi="Gill Sans MT" w:cs="Tahoma"/>
-          <w:b/>
+      <w:r>
+        <w:rPr>
+          <w:rFonts w:ascii="Gill Sans MT" w:hAnsi="Gill Sans MT" w:cs="Tahoma"/>
           <w:bCs/>
           <w:szCs w:val="20"/>
         </w:rPr>
-      </w:pPr>
+        <w:t xml:space="preserve"> and used </w:t>
+      </w:r>
       <w:r>
         <w:rPr>
           <w:rFonts w:ascii="Gill Sans MT" w:hAnsi="Gill Sans MT" w:cs="Tahoma"/>
           <w:bCs/>
           <w:szCs w:val="20"/>
         </w:rPr>
-        <w:t>Visual Studio Team Foundation Server Source Control and Visual Studio Online DevOps</w:t>
+        <w:t xml:space="preserve">Visual Studio Team Foundation Server Source Control </w:t>
+      </w:r>
+      <w:r>
+        <w:rPr>
+          <w:rFonts w:ascii="Gill Sans MT" w:hAnsi="Gill Sans MT" w:cs="Tahoma"/>
+          <w:bCs/>
+          <w:szCs w:val="20"/>
+        </w:rPr>
+        <w:t>with</w:t>
+      </w:r>
+      <w:r>
+        <w:rPr>
+          <w:rFonts w:ascii="Gill Sans MT" w:hAnsi="Gill Sans MT" w:cs="Tahoma"/>
+          <w:bCs/>
+          <w:szCs w:val="20"/>
+        </w:rPr>
+        <w:t xml:space="preserve"> Visual Studio Online DevOps</w:t>
       </w:r>
     </w:p>
     <w:p>
@@ -3067,7 +3121,42 @@
           <w:rFonts w:ascii="Gill Sans MT" w:hAnsi="Gill Sans MT" w:cs="Tahoma"/>
           <w:szCs w:val="20"/>
         </w:rPr>
-        <w:t>Worked with Architects, Business Analysts and QAs to single-handedly deliver a Supply Chain critical system</w:t>
+        <w:t>Collaborated</w:t>
+      </w:r>
+      <w:r>
+        <w:rPr>
+          <w:rFonts w:ascii="Gill Sans MT" w:hAnsi="Gill Sans MT" w:cs="Tahoma"/>
+          <w:szCs w:val="20"/>
+        </w:rPr>
+        <w:t xml:space="preserve"> with Architects, </w:t>
+      </w:r>
+      <w:r>
+        <w:rPr>
+          <w:rFonts w:ascii="Gill Sans MT" w:hAnsi="Gill Sans MT" w:cs="Tahoma"/>
+          <w:szCs w:val="20"/>
+        </w:rPr>
+        <w:t>BAs</w:t>
+      </w:r>
+      <w:r>
+        <w:rPr>
+          <w:rFonts w:ascii="Gill Sans MT" w:hAnsi="Gill Sans MT" w:cs="Tahoma"/>
+          <w:szCs w:val="20"/>
+        </w:rPr>
+        <w:t xml:space="preserve"> and QAs to single-handedly </w:t>
+      </w:r>
+      <w:r>
+        <w:rPr>
+          <w:rFonts w:ascii="Gill Sans MT" w:hAnsi="Gill Sans MT" w:cs="Tahoma"/>
+          <w:szCs w:val="20"/>
+        </w:rPr>
+        <w:t>implement</w:t>
+      </w:r>
+      <w:r>
+        <w:rPr>
+          <w:rFonts w:ascii="Gill Sans MT" w:hAnsi="Gill Sans MT" w:cs="Tahoma"/>
+          <w:szCs w:val="20"/>
+        </w:rPr>
+        <w:t xml:space="preserve"> a Supply Chain critical system</w:t>
       </w:r>
     </w:p>
     <w:p>
@@ -3333,7 +3422,23 @@
           <w:rFonts w:ascii="Gill Sans MT" w:hAnsi="Gill Sans MT" w:cs="Tahoma"/>
           <w:szCs w:val="20"/>
         </w:rPr>
-        <w:t xml:space="preserve"> – giving me a First Class Grade</w:t>
+        <w:t xml:space="preserve"> – giving me a </w:t>
+      </w:r>
+      <w:proofErr w:type="gramStart"/>
+      <w:r>
+        <w:rPr>
+          <w:rFonts w:ascii="Gill Sans MT" w:hAnsi="Gill Sans MT" w:cs="Tahoma"/>
+          <w:szCs w:val="20"/>
+        </w:rPr>
+        <w:t>First Class</w:t>
+      </w:r>
+      <w:proofErr w:type="gramEnd"/>
+      <w:r>
+        <w:rPr>
+          <w:rFonts w:ascii="Gill Sans MT" w:hAnsi="Gill Sans MT" w:cs="Tahoma"/>
+          <w:szCs w:val="20"/>
+        </w:rPr>
+        <w:t xml:space="preserve"> Grade</w:t>
       </w:r>
     </w:p>
     <w:p>
@@ -3391,13 +3496,6 @@
           <w:noProof/>
           <w:szCs w:val="20"/>
         </w:rPr>
-      </w:r>
-      <w:r>
-        <w:rPr>
-          <w:rFonts w:ascii="Gill Sans MT" w:hAnsi="Gill Sans MT" w:cs="Tahoma"/>
-          <w:noProof/>
-          <w:szCs w:val="20"/>
-        </w:rPr>
         <w:pict w14:anchorId="6AEAAC19">
           <v:rect id="_x0000_i1026" style="width:451.3pt;height:2pt;mso-position-vertical:absolute" o:hralign="center" o:hrstd="t" o:hrnoshade="t" o:hr="t" fillcolor="black [3213]" stroked="f"/>
         </w:pict>
@@ -3436,16 +3534,16 @@
         <mc:AlternateContent>
           <mc:Choice Requires="wps">
             <w:drawing>
-              <wp:anchor distT="45720" distB="45720" distL="114300" distR="114300" simplePos="0" relativeHeight="251658245" behindDoc="0" locked="0" layoutInCell="1" allowOverlap="1" wp14:anchorId="56527EEB" wp14:editId="084B224F">
+              <wp:anchor distT="45720" distB="45720" distL="114300" distR="114300" simplePos="0" relativeHeight="251658245" behindDoc="0" locked="0" layoutInCell="1" allowOverlap="1" wp14:anchorId="56527EEB" wp14:editId="4C10E7BB">
                 <wp:simplePos x="0" y="0"/>
                 <wp:positionH relativeFrom="column">
                   <wp:posOffset>-97790</wp:posOffset>
                 </wp:positionH>
                 <wp:positionV relativeFrom="paragraph">
-                  <wp:posOffset>1631950</wp:posOffset>
+                  <wp:posOffset>1628775</wp:posOffset>
                 </wp:positionV>
-                <wp:extent cx="7047230" cy="474345"/>
-                <wp:effectExtent l="0" t="0" r="0" b="1905"/>
+                <wp:extent cx="7047230" cy="762000"/>
+                <wp:effectExtent l="0" t="0" r="0" b="0"/>
                 <wp:wrapSquare wrapText="bothSides"/>
                 <wp:docPr id="217" name="Text Box 2"/>
                 <wp:cNvGraphicFramePr>
@@ -3460,158 +3558,7 @@
                       <wps:spPr bwMode="auto">
                         <a:xfrm>
                           <a:off x="0" y="0"/>
-                          <a:ext cx="7047230" cy="474345"/>
-                        </a:xfrm>
-                        <a:prstGeom prst="rect">
-                          <a:avLst/>
-                        </a:prstGeom>
-                        <a:noFill/>
-                        <a:ln w="9525">
-                          <a:noFill/>
-                          <a:miter lim="800000"/>
-                          <a:headEnd/>
-                          <a:tailEnd/>
-                        </a:ln>
-                      </wps:spPr>
-                      <wps:txbx>
-                        <w:txbxContent>
-                          <w:p>
-                            <w:pPr>
-                              <w:rPr>
-                                <w:rFonts w:ascii="Gill Sans MT" w:hAnsi="Gill Sans MT" w:cs="Tahoma"/>
-                                <w:sz w:val="20"/>
-                                <w:szCs w:val="20"/>
-                              </w:rPr>
-                            </w:pPr>
-                            <w:r>
-                              <w:rPr>
-                                <w:rFonts w:ascii="Gill Sans MT" w:hAnsi="Gill Sans MT" w:cs="Tahoma"/>
-                                <w:b/>
-                                <w:sz w:val="20"/>
-                                <w:szCs w:val="20"/>
-                              </w:rPr>
-                              <w:t xml:space="preserve">4 A levels, 1 AS level (Netherthorpe School Sixth Form) </w:t>
-                            </w:r>
-                            <w:r>
-                              <w:rPr>
-                                <w:rFonts w:ascii="Gill Sans MT" w:hAnsi="Gill Sans MT" w:cs="Tahoma"/>
-                                <w:b/>
-                                <w:sz w:val="20"/>
-                                <w:szCs w:val="20"/>
-                              </w:rPr>
-                              <w:br/>
-                            </w:r>
-                            <w:r>
-                              <w:rPr>
-                                <w:rFonts w:ascii="Gill Sans MT" w:hAnsi="Gill Sans MT" w:cs="Tahoma"/>
-                                <w:sz w:val="20"/>
-                                <w:szCs w:val="20"/>
-                              </w:rPr>
-                              <w:t>Computing (D) Geography (C) Mathematics (E) General Studies (D) AS Level History (E)</w:t>
-                            </w:r>
-                          </w:p>
-                        </w:txbxContent>
-                      </wps:txbx>
-                      <wps:bodyPr rot="0" vert="horz" wrap="square" lIns="91440" tIns="45720" rIns="91440" bIns="45720" anchor="t" anchorCtr="0">
-                        <a:noAutofit/>
-                      </wps:bodyPr>
-                    </wps:wsp>
-                  </a:graphicData>
-                </a:graphic>
-                <wp14:sizeRelH relativeFrom="margin">
-                  <wp14:pctWidth>0</wp14:pctWidth>
-                </wp14:sizeRelH>
-                <wp14:sizeRelV relativeFrom="margin">
-                  <wp14:pctHeight>0</wp14:pctHeight>
-                </wp14:sizeRelV>
-              </wp:anchor>
-            </w:drawing>
-          </mc:Choice>
-          <mc:Fallback>
-            <w:pict>
-              <v:shapetype w14:anchorId="56527EEB" id="_x0000_t202" coordsize="21600,21600" o:spt="202" path="m,l,21600r21600,l21600,xe">
-                <v:stroke joinstyle="miter"/>
-                <v:path gradientshapeok="t" o:connecttype="rect"/>
-              </v:shapetype>
-              <v:shape id="_x0000_s1031" type="#_x0000_t202" style="position:absolute;margin-left:-7.7pt;margin-top:128.5pt;width:554.9pt;height:37.35pt;z-index:251658245;visibility:visible;mso-wrap-style:square;mso-width-percent:0;mso-height-percent:0;mso-wrap-distance-left:9pt;mso-wrap-distance-top:3.6pt;mso-wrap-distance-right:9pt;mso-wrap-distance-bottom:3.6pt;mso-position-horizontal:absolute;mso-position-horizontal-relative:text;mso-position-vertical:absolute;mso-position-vertical-relative:text;mso-width-percent:0;mso-height-percent:0;mso-width-relative:margin;mso-height-relative:margin;v-text-anchor:top" o:gfxdata="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" filled="f" stroked="f">
-                <v:textbox>
-                  <w:txbxContent>
-                    <w:p>
-                      <w:pPr>
-                        <w:rPr>
-                          <w:rFonts w:ascii="Gill Sans MT" w:hAnsi="Gill Sans MT" w:cs="Tahoma"/>
-                          <w:sz w:val="20"/>
-                          <w:szCs w:val="20"/>
-                        </w:rPr>
-                      </w:pPr>
-                      <w:r>
-                        <w:rPr>
-                          <w:rFonts w:ascii="Gill Sans MT" w:hAnsi="Gill Sans MT" w:cs="Tahoma"/>
-                          <w:b/>
-                          <w:sz w:val="20"/>
-                          <w:szCs w:val="20"/>
-                        </w:rPr>
-                        <w:t xml:space="preserve">4 A levels, 1 AS level (Netherthorpe School Sixth Form) </w:t>
-                      </w:r>
-                      <w:r>
-                        <w:rPr>
-                          <w:rFonts w:ascii="Gill Sans MT" w:hAnsi="Gill Sans MT" w:cs="Tahoma"/>
-                          <w:b/>
-                          <w:sz w:val="20"/>
-                          <w:szCs w:val="20"/>
-                        </w:rPr>
-                        <w:br/>
-                      </w:r>
-                      <w:r>
-                        <w:rPr>
-                          <w:rFonts w:ascii="Gill Sans MT" w:hAnsi="Gill Sans MT" w:cs="Tahoma"/>
-                          <w:sz w:val="20"/>
-                          <w:szCs w:val="20"/>
-                        </w:rPr>
-                        <w:t>Computing (D) Geography (C) Mathematics (E) General Studies (D) AS Level History (E)</w:t>
-                      </w:r>
-                    </w:p>
-                  </w:txbxContent>
-                </v:textbox>
-                <w10:wrap type="square"/>
-              </v:shape>
-            </w:pict>
-          </mc:Fallback>
-        </mc:AlternateContent>
-      </w:r>
-      <w:r>
-        <w:rPr>
-          <w:noProof/>
-          <w:lang w:eastAsia="en-GB"/>
-        </w:rPr>
-        <mc:AlternateContent>
-          <mc:Choice Requires="wps">
-            <w:drawing>
-              <wp:anchor distT="0" distB="0" distL="114300" distR="114300" simplePos="0" relativeHeight="251658243" behindDoc="0" locked="0" layoutInCell="1" allowOverlap="1" wp14:anchorId="11D49857" wp14:editId="7B2CF118">
-                <wp:simplePos x="0" y="0"/>
-                <wp:positionH relativeFrom="column">
-                  <wp:posOffset>-100330</wp:posOffset>
-                </wp:positionH>
-                <wp:positionV relativeFrom="paragraph">
-                  <wp:posOffset>2078990</wp:posOffset>
-                </wp:positionV>
-                <wp:extent cx="7200900" cy="525780"/>
-                <wp:effectExtent l="0" t="0" r="0" b="0"/>
-                <wp:wrapSquare wrapText="bothSides"/>
-                <wp:docPr id="2" name="Text Box 2"/>
-                <wp:cNvGraphicFramePr>
-                  <a:graphicFrameLocks xmlns:a="http://schemas.openxmlformats.org/drawingml/2006/main"/>
-                </wp:cNvGraphicFramePr>
-                <a:graphic xmlns:a="http://schemas.openxmlformats.org/drawingml/2006/main">
-                  <a:graphicData uri="http://schemas.microsoft.com/office/word/2010/wordprocessingShape">
-                    <wps:wsp>
-                      <wps:cNvSpPr txBox="1">
-                        <a:spLocks noChangeArrowheads="1"/>
-                      </wps:cNvSpPr>
-                      <wps:spPr bwMode="auto">
-                        <a:xfrm>
-                          <a:off x="0" y="0"/>
-                          <a:ext cx="7200900" cy="525780"/>
+                          <a:ext cx="7047230" cy="762000"/>
                         </a:xfrm>
                         <a:prstGeom prst="rect">
                           <a:avLst/>
@@ -3639,8 +3586,80 @@
                                 <w:rFonts w:ascii="Gill Sans MT" w:hAnsi="Gill Sans MT" w:cs="Tahoma"/>
                                 <w:b/>
                                 <w:sz w:val="20"/>
+                                <w:szCs w:val="20"/>
                               </w:rPr>
-                              <w:t>8 GCSEs (Netherthorpe School)</w:t>
+                              <w:t>4 A levels, 1 AS level (</w:t>
+                            </w:r>
+                            <w:proofErr w:type="spellStart"/>
+                            <w:r>
+                              <w:rPr>
+                                <w:rFonts w:ascii="Gill Sans MT" w:hAnsi="Gill Sans MT" w:cs="Tahoma"/>
+                                <w:b/>
+                                <w:sz w:val="20"/>
+                                <w:szCs w:val="20"/>
+                              </w:rPr>
+                              <w:t>Netherthorpe</w:t>
+                            </w:r>
+                            <w:proofErr w:type="spellEnd"/>
+                            <w:r>
+                              <w:rPr>
+                                <w:rFonts w:ascii="Gill Sans MT" w:hAnsi="Gill Sans MT" w:cs="Tahoma"/>
+                                <w:b/>
+                                <w:sz w:val="20"/>
+                                <w:szCs w:val="20"/>
+                              </w:rPr>
+                              <w:t xml:space="preserve"> School Sixth Form)</w:t>
+                            </w:r>
+                            <w:r>
+                              <w:rPr>
+                                <w:rFonts w:ascii="Gill Sans MT" w:hAnsi="Gill Sans MT" w:cs="Tahoma"/>
+                                <w:b/>
+                                <w:sz w:val="20"/>
+                                <w:szCs w:val="20"/>
+                              </w:rPr>
+                              <w:br/>
+                            </w:r>
+                            <w:r>
+                              <w:rPr>
+                                <w:rFonts w:ascii="Gill Sans MT" w:hAnsi="Gill Sans MT" w:cs="Tahoma"/>
+                                <w:sz w:val="20"/>
+                                <w:szCs w:val="20"/>
+                              </w:rPr>
+                              <w:t>Computing (D) Geography (C) Mathematics (E) General Studies (D) AS Level History (E)</w:t>
+                            </w:r>
+                            <w:r>
+                              <w:rPr>
+                                <w:rFonts w:ascii="Gill Sans MT" w:hAnsi="Gill Sans MT" w:cs="Tahoma"/>
+                                <w:sz w:val="20"/>
+                                <w:szCs w:val="20"/>
+                              </w:rPr>
+                              <w:br/>
+                            </w:r>
+                            <w:r>
+                              <w:rPr>
+                                <w:rFonts w:ascii="Gill Sans MT" w:hAnsi="Gill Sans MT" w:cs="Tahoma"/>
+                                <w:b/>
+                                <w:sz w:val="20"/>
+                              </w:rPr>
+                              <w:t>8 GCSEs (</w:t>
+                            </w:r>
+                            <w:proofErr w:type="spellStart"/>
+                            <w:r>
+                              <w:rPr>
+                                <w:rFonts w:ascii="Gill Sans MT" w:hAnsi="Gill Sans MT" w:cs="Tahoma"/>
+                                <w:b/>
+                                <w:sz w:val="20"/>
+                              </w:rPr>
+                              <w:t>Netherthorpe</w:t>
+                            </w:r>
+                            <w:proofErr w:type="spellEnd"/>
+                            <w:r>
+                              <w:rPr>
+                                <w:rFonts w:ascii="Gill Sans MT" w:hAnsi="Gill Sans MT" w:cs="Tahoma"/>
+                                <w:b/>
+                                <w:sz w:val="20"/>
+                              </w:rPr>
+                              <w:t xml:space="preserve"> School)</w:t>
                             </w:r>
                             <w:r>
                               <w:rPr>
@@ -3657,6 +3676,15 @@
                               </w:rPr>
                               <w:t>Maths (A) English (A) OCR Level 2 National First Award ICT (Distinction) OCR Level 2 National Award ICT: (Distinction)</w:t>
                             </w:r>
+                          </w:p>
+                          <w:p>
+                            <w:pPr>
+                              <w:rPr>
+                                <w:rFonts w:ascii="Gill Sans MT" w:hAnsi="Gill Sans MT" w:cs="Tahoma"/>
+                                <w:sz w:val="20"/>
+                                <w:szCs w:val="20"/>
+                              </w:rPr>
+                            </w:pPr>
                           </w:p>
                         </w:txbxContent>
                       </wps:txbx>
@@ -3677,7 +3705,7 @@
           </mc:Choice>
           <mc:Fallback>
             <w:pict>
-              <v:shape w14:anchorId="11D49857" id="_x0000_s1032" type="#_x0000_t202" style="position:absolute;margin-left:-7.9pt;margin-top:163.7pt;width:567pt;height:41.4pt;z-index:251658243;visibility:visible;mso-wrap-style:square;mso-width-percent:0;mso-height-percent:0;mso-wrap-distance-left:9pt;mso-wrap-distance-top:0;mso-wrap-distance-right:9pt;mso-wrap-distance-bottom:0;mso-position-horizontal:absolute;mso-position-horizontal-relative:text;mso-position-vertical:absolute;mso-position-vertical-relative:text;mso-width-percent:0;mso-height-percent:0;mso-width-relative:margin;mso-height-relative:margin;v-text-anchor:top" o:gfxdata="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" filled="f" stroked="f">
+              <v:shape w14:anchorId="56527EEB" id="_x0000_s1031" type="#_x0000_t202" style="position:absolute;margin-left:-7.7pt;margin-top:128.25pt;width:554.9pt;height:60pt;z-index:251658245;visibility:visible;mso-wrap-style:square;mso-width-percent:0;mso-height-percent:0;mso-wrap-distance-left:9pt;mso-wrap-distance-top:3.6pt;mso-wrap-distance-right:9pt;mso-wrap-distance-bottom:3.6pt;mso-position-horizontal:absolute;mso-position-horizontal-relative:text;mso-position-vertical:absolute;mso-position-vertical-relative:text;mso-width-percent:0;mso-height-percent:0;mso-width-relative:margin;mso-height-relative:margin;v-text-anchor:top" o:gfxdata="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" filled="f" stroked="f">
                 <v:textbox>
                   <w:txbxContent>
                     <w:p>
@@ -3688,6 +3716,60 @@
                           <w:sz w:val="20"/>
                         </w:rPr>
                       </w:pPr>
+                      <w:r>
+                        <w:rPr>
+                          <w:rFonts w:ascii="Gill Sans MT" w:hAnsi="Gill Sans MT" w:cs="Tahoma"/>
+                          <w:b/>
+                          <w:sz w:val="20"/>
+                          <w:szCs w:val="20"/>
+                        </w:rPr>
+                        <w:t>4 A levels, 1 AS level (</w:t>
+                      </w:r>
+                      <w:proofErr w:type="spellStart"/>
+                      <w:r>
+                        <w:rPr>
+                          <w:rFonts w:ascii="Gill Sans MT" w:hAnsi="Gill Sans MT" w:cs="Tahoma"/>
+                          <w:b/>
+                          <w:sz w:val="20"/>
+                          <w:szCs w:val="20"/>
+                        </w:rPr>
+                        <w:t>Netherthorpe</w:t>
+                      </w:r>
+                      <w:proofErr w:type="spellEnd"/>
+                      <w:r>
+                        <w:rPr>
+                          <w:rFonts w:ascii="Gill Sans MT" w:hAnsi="Gill Sans MT" w:cs="Tahoma"/>
+                          <w:b/>
+                          <w:sz w:val="20"/>
+                          <w:szCs w:val="20"/>
+                        </w:rPr>
+                        <w:t xml:space="preserve"> School Sixth Form)</w:t>
+                      </w:r>
+                      <w:r>
+                        <w:rPr>
+                          <w:rFonts w:ascii="Gill Sans MT" w:hAnsi="Gill Sans MT" w:cs="Tahoma"/>
+                          <w:b/>
+                          <w:sz w:val="20"/>
+                          <w:szCs w:val="20"/>
+                        </w:rPr>
+                        <w:br/>
+                      </w:r>
+                      <w:r>
+                        <w:rPr>
+                          <w:rFonts w:ascii="Gill Sans MT" w:hAnsi="Gill Sans MT" w:cs="Tahoma"/>
+                          <w:sz w:val="20"/>
+                          <w:szCs w:val="20"/>
+                        </w:rPr>
+                        <w:t>Computing (D) Geography (C) Mathematics (E) General Studies (D) AS Level History (E)</w:t>
+                      </w:r>
+                      <w:r>
+                        <w:rPr>
+                          <w:rFonts w:ascii="Gill Sans MT" w:hAnsi="Gill Sans MT" w:cs="Tahoma"/>
+                          <w:sz w:val="20"/>
+                          <w:szCs w:val="20"/>
+                        </w:rPr>
+                        <w:br/>
+                      </w:r>
                       <w:r>
                         <w:rPr>
                           <w:rFonts w:ascii="Gill Sans MT" w:hAnsi="Gill Sans MT" w:cs="Tahoma"/>
@@ -3730,6 +3812,15 @@
                         <w:t>Maths (A) English (A) OCR Level 2 National First Award ICT (Distinction) OCR Level 2 National Award ICT: (Distinction)</w:t>
                       </w:r>
                     </w:p>
+                    <w:p>
+                      <w:pPr>
+                        <w:rPr>
+                          <w:rFonts w:ascii="Gill Sans MT" w:hAnsi="Gill Sans MT" w:cs="Tahoma"/>
+                          <w:sz w:val="20"/>
+                          <w:szCs w:val="20"/>
+                        </w:rPr>
+                      </w:pPr>
+                    </w:p>
                   </w:txbxContent>
                 </v:textbox>
                 <w10:wrap type="square"/>
@@ -3746,7 +3837,7 @@
         <mc:AlternateContent>
           <mc:Choice Requires="wps">
             <w:drawing>
-              <wp:anchor distT="45720" distB="45720" distL="114300" distR="114300" simplePos="0" relativeHeight="251658247" behindDoc="0" locked="0" layoutInCell="1" allowOverlap="1" wp14:anchorId="4C917329" wp14:editId="13E48D9A">
+              <wp:anchor distT="45720" distB="45720" distL="114300" distR="114300" simplePos="0" relativeHeight="251658247" behindDoc="0" locked="0" layoutInCell="1" allowOverlap="1" wp14:anchorId="4C917329" wp14:editId="50361676">
                 <wp:simplePos x="0" y="0"/>
                 <wp:positionH relativeFrom="column">
                   <wp:posOffset>-97790</wp:posOffset>
@@ -3875,7 +3966,7 @@
           </mc:Choice>
           <mc:Fallback>
             <w:pict>
-              <v:shape w14:anchorId="4C917329" id="_x0000_s1033" type="#_x0000_t202" style="position:absolute;margin-left:-7.7pt;margin-top:17pt;width:244.5pt;height:115.5pt;z-index:251658247;visibility:visible;mso-wrap-style:square;mso-width-percent:0;mso-height-percent:0;mso-wrap-distance-left:9pt;mso-wrap-distance-top:3.6pt;mso-wrap-distance-right:9pt;mso-wrap-distance-bottom:3.6pt;mso-position-horizontal:absolute;mso-position-horizontal-relative:text;mso-position-vertical:absolute;mso-position-vertical-relative:text;mso-width-percent:0;mso-height-percent:0;mso-width-relative:margin;mso-height-relative:margin;v-text-anchor:top" o:gfxdata="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" filled="f" stroked="f">
+              <v:shape w14:anchorId="4C917329" id="_x0000_s1032" type="#_x0000_t202" style="position:absolute;margin-left:-7.7pt;margin-top:17pt;width:244.5pt;height:115.5pt;z-index:251658247;visibility:visible;mso-wrap-style:square;mso-width-percent:0;mso-height-percent:0;mso-wrap-distance-left:9pt;mso-wrap-distance-top:3.6pt;mso-wrap-distance-right:9pt;mso-wrap-distance-bottom:3.6pt;mso-position-horizontal:absolute;mso-position-horizontal-relative:text;mso-position-vertical:absolute;mso-position-vertical-relative:text;mso-width-percent:0;mso-height-percent:0;mso-width-relative:margin;mso-height-relative:margin;v-text-anchor:top" o:gfxdata="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" filled="f" stroked="f">
                 <v:textbox>
                   <w:txbxContent>
                     <w:p>
@@ -4137,7 +4228,7 @@
           </mc:Choice>
           <mc:Fallback>
             <w:pict>
-              <v:shape w14:anchorId="1D09B716" id="_x0000_s1034" type="#_x0000_t202" style="position:absolute;margin-left:214.3pt;margin-top:17pt;width:289.5pt;height:110.6pt;z-index:251658246;visibility:visible;mso-wrap-style:square;mso-width-percent:0;mso-height-percent:0;mso-wrap-distance-left:9pt;mso-wrap-distance-top:3.6pt;mso-wrap-distance-right:9pt;mso-wrap-distance-bottom:3.6pt;mso-position-horizontal:absolute;mso-position-horizontal-relative:text;mso-position-vertical:absolute;mso-position-vertical-relative:text;mso-width-percent:0;mso-height-percent:0;mso-width-relative:margin;mso-height-relative:margin;v-text-anchor:top" o:gfxdata="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" filled="f" stroked="f">
+              <v:shape w14:anchorId="1D09B716" id="_x0000_s1033" type="#_x0000_t202" style="position:absolute;margin-left:214.3pt;margin-top:17pt;width:289.5pt;height:110.6pt;z-index:251658246;visibility:visible;mso-wrap-style:square;mso-width-percent:0;mso-height-percent:0;mso-wrap-distance-left:9pt;mso-wrap-distance-top:3.6pt;mso-wrap-distance-right:9pt;mso-wrap-distance-bottom:3.6pt;mso-position-horizontal:absolute;mso-position-horizontal-relative:text;mso-position-vertical:absolute;mso-position-vertical-relative:text;mso-width-percent:0;mso-height-percent:0;mso-width-relative:margin;mso-height-relative:margin;v-text-anchor:top" o:gfxdata="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" filled="f" stroked="f">
                 <v:textbox style="mso-fit-shape-to-text:t">
                   <w:txbxContent>
                     <w:p>
@@ -4294,13 +4385,6 @@
           <w:noProof/>
           <w:szCs w:val="20"/>
         </w:rPr>
-      </w:r>
-      <w:r>
-        <w:rPr>
-          <w:rFonts w:ascii="Gill Sans MT" w:hAnsi="Gill Sans MT" w:cs="Tahoma"/>
-          <w:noProof/>
-          <w:szCs w:val="20"/>
-        </w:rPr>
         <w:pict w14:anchorId="1CABA2B7">
           <v:rect id="_x0000_i1027" style="width:451.3pt;height:2pt;mso-position-vertical:absolute" o:hralign="center" o:hrstd="t" o:hrnoshade="t" o:hr="t" fillcolor="black [3213]" stroked="f"/>
         </w:pict>
@@ -4344,7 +4428,7 @@
         </w:rPr>
         <w:t xml:space="preserve">IT Volunteer at </w:t>
       </w:r>
-      <w:hyperlink r:id="rId23" w:history="1">
+      <w:hyperlink r:id="rId25" w:history="1">
         <w:r>
           <w:rPr>
             <w:rStyle w:val="Hyperlink"/>
@@ -4354,44 +4438,8 @@
             <w:szCs w:val="20"/>
             <w:u w:val="none"/>
           </w:rPr>
-          <w:t>Ashgate Hospicecare</w:t>
+          <w:t>Ashgate H</w:t>
         </w:r>
-      </w:hyperlink>
-    </w:p>
-    <w:p>
-      <w:pPr>
-        <w:pStyle w:val="ListParagraph"/>
-        <w:numPr>
-          <w:ilvl w:val="0"/>
-          <w:numId w:val="3"/>
-        </w:numPr>
-        <w:rPr>
-          <w:rFonts w:ascii="Gill Sans MT" w:hAnsi="Gill Sans MT" w:cs="Tahoma"/>
-          <w:szCs w:val="20"/>
-        </w:rPr>
-      </w:pPr>
-      <w:r>
-        <w:rPr>
-          <w:rFonts w:ascii="Gill Sans MT" w:hAnsi="Gill Sans MT" w:cs="Tahoma"/>
-          <w:szCs w:val="20"/>
-        </w:rPr>
-        <w:t>Programming portfoli</w:t>
-      </w:r>
-      <w:r>
-        <w:rPr>
-          <w:rFonts w:ascii="Gill Sans MT" w:hAnsi="Gill Sans MT" w:cs="Tahoma"/>
-          <w:szCs w:val="20"/>
-        </w:rPr>
-        <w:t>o</w:t>
-      </w:r>
-      <w:r>
-        <w:rPr>
-          <w:rFonts w:ascii="Gill Sans MT" w:hAnsi="Gill Sans MT" w:cs="Tahoma"/>
-          <w:szCs w:val="20"/>
-        </w:rPr>
-        <w:t xml:space="preserve">: </w:t>
-      </w:r>
-      <w:hyperlink r:id="rId24" w:history="1">
         <w:r>
           <w:rPr>
             <w:rStyle w:val="Hyperlink"/>
@@ -4401,16 +4449,20 @@
             <w:szCs w:val="20"/>
             <w:u w:val="none"/>
           </w:rPr>
-          <w:t>www.ashley-gibson.co.uk/portfolio.html</w:t>
+          <w:t>o</w:t>
+        </w:r>
+        <w:r>
+          <w:rPr>
+            <w:rStyle w:val="Hyperlink"/>
+            <w:rFonts w:ascii="Gill Sans MT" w:hAnsi="Gill Sans MT" w:cs="Tahoma"/>
+            <w:b/>
+            <w:bCs/>
+            <w:szCs w:val="20"/>
+            <w:u w:val="none"/>
+          </w:rPr>
+          <w:t>spicecare</w:t>
         </w:r>
       </w:hyperlink>
-      <w:r>
-        <w:rPr>
-          <w:rFonts w:ascii="Gill Sans MT" w:hAnsi="Gill Sans MT" w:cs="Tahoma"/>
-          <w:szCs w:val="20"/>
-        </w:rPr>
-        <w:t xml:space="preserve"> </w:t>
-      </w:r>
     </w:p>
     <w:p>
       <w:pPr>
@@ -4429,43 +4481,35 @@
           <w:rFonts w:ascii="Gill Sans MT" w:hAnsi="Gill Sans MT" w:cs="Tahoma"/>
           <w:szCs w:val="20"/>
         </w:rPr>
-        <w:t xml:space="preserve">Sheffield Hallam University Table Tennis Club – </w:t>
-      </w:r>
-      <w:r>
-        <w:rPr>
-          <w:rFonts w:ascii="Gill Sans MT" w:hAnsi="Gill Sans MT" w:cs="Tahoma"/>
-          <w:szCs w:val="20"/>
-        </w:rPr>
-        <w:t xml:space="preserve">Former </w:t>
-      </w:r>
-      <w:r>
-        <w:rPr>
-          <w:rFonts w:ascii="Gill Sans MT" w:hAnsi="Gill Sans MT" w:cs="Tahoma"/>
-          <w:szCs w:val="20"/>
-        </w:rPr>
-        <w:t>Chairman</w:t>
-      </w:r>
-      <w:r>
-        <w:rPr>
-          <w:rFonts w:ascii="Gill Sans MT" w:hAnsi="Gill Sans MT" w:cs="Tahoma"/>
-          <w:szCs w:val="20"/>
-        </w:rPr>
-        <w:t>/</w:t>
-      </w:r>
-      <w:r>
-        <w:rPr>
-          <w:rFonts w:ascii="Gill Sans MT" w:hAnsi="Gill Sans MT" w:cs="Tahoma"/>
-          <w:szCs w:val="20"/>
-        </w:rPr>
-        <w:t>Captain, Goalkeeper and Badminton</w:t>
-      </w:r>
-      <w:r>
-        <w:rPr>
-          <w:rFonts w:ascii="Gill Sans MT" w:hAnsi="Gill Sans MT" w:cs="Tahoma"/>
-          <w:szCs w:val="20"/>
-        </w:rPr>
-        <w:t xml:space="preserve"> player</w:t>
-      </w:r>
+        <w:t>Programming portfoli</w:t>
+      </w:r>
+      <w:r>
+        <w:rPr>
+          <w:rFonts w:ascii="Gill Sans MT" w:hAnsi="Gill Sans MT" w:cs="Tahoma"/>
+          <w:szCs w:val="20"/>
+        </w:rPr>
+        <w:t>o</w:t>
+      </w:r>
+      <w:r>
+        <w:rPr>
+          <w:rFonts w:ascii="Gill Sans MT" w:hAnsi="Gill Sans MT" w:cs="Tahoma"/>
+          <w:szCs w:val="20"/>
+        </w:rPr>
+        <w:t xml:space="preserve">: </w:t>
+      </w:r>
+      <w:hyperlink r:id="rId26" w:history="1">
+        <w:r>
+          <w:rPr>
+            <w:rStyle w:val="Hyperlink"/>
+            <w:rFonts w:ascii="Gill Sans MT" w:hAnsi="Gill Sans MT" w:cs="Tahoma"/>
+            <w:b/>
+            <w:bCs/>
+            <w:szCs w:val="20"/>
+            <w:u w:val="none"/>
+          </w:rPr>
+          <w:t>www.ashley-gibson.co.uk/portfolio</w:t>
+        </w:r>
+      </w:hyperlink>
     </w:p>
     <w:p>
       <w:pPr>
@@ -4484,6 +4528,61 @@
           <w:rFonts w:ascii="Gill Sans MT" w:hAnsi="Gill Sans MT" w:cs="Tahoma"/>
           <w:szCs w:val="20"/>
         </w:rPr>
+        <w:t xml:space="preserve">Sheffield Hallam University Table Tennis Club – </w:t>
+      </w:r>
+      <w:r>
+        <w:rPr>
+          <w:rFonts w:ascii="Gill Sans MT" w:hAnsi="Gill Sans MT" w:cs="Tahoma"/>
+          <w:szCs w:val="20"/>
+        </w:rPr>
+        <w:t xml:space="preserve">Former </w:t>
+      </w:r>
+      <w:r>
+        <w:rPr>
+          <w:rFonts w:ascii="Gill Sans MT" w:hAnsi="Gill Sans MT" w:cs="Tahoma"/>
+          <w:szCs w:val="20"/>
+        </w:rPr>
+        <w:t>Chairman</w:t>
+      </w:r>
+      <w:r>
+        <w:rPr>
+          <w:rFonts w:ascii="Gill Sans MT" w:hAnsi="Gill Sans MT" w:cs="Tahoma"/>
+          <w:szCs w:val="20"/>
+        </w:rPr>
+        <w:t>/</w:t>
+      </w:r>
+      <w:r>
+        <w:rPr>
+          <w:rFonts w:ascii="Gill Sans MT" w:hAnsi="Gill Sans MT" w:cs="Tahoma"/>
+          <w:szCs w:val="20"/>
+        </w:rPr>
+        <w:t>Captain, Goalkeeper and Badminton</w:t>
+      </w:r>
+      <w:r>
+        <w:rPr>
+          <w:rFonts w:ascii="Gill Sans MT" w:hAnsi="Gill Sans MT" w:cs="Tahoma"/>
+          <w:szCs w:val="20"/>
+        </w:rPr>
+        <w:t xml:space="preserve"> player</w:t>
+      </w:r>
+    </w:p>
+    <w:p>
+      <w:pPr>
+        <w:pStyle w:val="ListParagraph"/>
+        <w:numPr>
+          <w:ilvl w:val="0"/>
+          <w:numId w:val="3"/>
+        </w:numPr>
+        <w:rPr>
+          <w:rFonts w:ascii="Gill Sans MT" w:hAnsi="Gill Sans MT" w:cs="Tahoma"/>
+          <w:szCs w:val="20"/>
+        </w:rPr>
+      </w:pPr>
+      <w:r>
+        <w:rPr>
+          <w:rFonts w:ascii="Gill Sans MT" w:hAnsi="Gill Sans MT" w:cs="Tahoma"/>
+          <w:szCs w:val="20"/>
+        </w:rPr>
         <w:t xml:space="preserve">Led adventure </w:t>
       </w:r>
       <w:r>
@@ -4516,7 +4615,7 @@
       </w:r>
     </w:p>
     <w:sectPr>
-      <w:footerReference w:type="default" r:id="rId25"/>
+      <w:footerReference w:type="default" r:id="rId27"/>
       <w:pgSz w:w="11906" w:h="16838"/>
       <w:pgMar w:top="0" w:right="707" w:bottom="0" w:left="709" w:header="0" w:footer="549" w:gutter="0"/>
       <w:cols w:space="708"/>
@@ -4527,7 +4626,7 @@
 </file>
 
 <file path=word/endnotes.xml><?xml version="1.0" encoding="utf-8"?>
-<w:endnotes xmlns:wpc="http://schemas.microsoft.com/office/word/2010/wordprocessingCanvas" xmlns:cx="http://schemas.microsoft.com/office/drawing/2014/chartex" xmlns:cx1="http://schemas.microsoft.com/office/drawing/2015/9/8/chartex" xmlns:cx2="http://schemas.microsoft.com/office/drawing/2015/10/21/chartex" xmlns:cx3="http://schemas.microsoft.com/office/drawing/2016/5/9/chartex" xmlns:cx4="http://schemas.microsoft.com/office/drawing/2016/5/10/chartex" xmlns:cx5="http://schemas.microsoft.com/office/drawing/2016/5/11/chartex" xmlns:cx6="http://schemas.microsoft.com/office/drawing/2016/5/12/chartex" xmlns:cx7="http://schemas.microsoft.com/office/drawing/2016/5/13/chartex" xmlns:cx8="http://schemas.microsoft.com/office/drawing/2016/5/14/chartex" xmlns:mc="http://schemas.openxmlformats.org/markup-compatibility/2006" xmlns:aink="http://schemas.microsoft.com/office/drawing/2016/ink" xmlns:am3d="http://schemas.microsoft.com/office/drawing/2017/model3d" xmlns:o="urn:schemas-microsoft-com:office:office" xmlns:oel="http://schemas.microsoft.com/office/2019/extlst" xmlns:r="http://schemas.openxmlformats.org/officeDocument/2006/relationships" xmlns:m="http://schemas.openxmlformats.org/officeDocument/2006/math" xmlns:v="urn:schemas-microsoft-com:vml" xmlns:wp14="http://schemas.microsoft.com/office/word/2010/wordprocessingDrawing" xmlns:wp="http://schemas.openxmlformats.org/drawingml/2006/wordprocessingDrawing" xmlns:w10="urn:schemas-microsoft-com:office:word" xmlns:w="http://schemas.openxmlformats.org/wordprocessingml/2006/main" xmlns:w14="http://schemas.microsoft.com/office/word/2010/wordml" xmlns:w15="http://schemas.microsoft.com/office/word/2012/wordml" xmlns:w16cex="http://schemas.microsoft.com/office/word/2018/wordml/cex" xmlns:w16cid="http://schemas.microsoft.com/office/word/2016/wordml/cid" xmlns:w16="http://schemas.microsoft.com/office/word/2018/wordml" xmlns:w16sdtdh="http://schemas.microsoft.com/office/word/2020/wordml/sdtdatahash" xmlns:w16se="http://schemas.microsoft.com/office/word/2015/wordml/symex" xmlns:wpg="http://schemas.microsoft.com/office/word/2010/wordprocessingGroup" xmlns:wpi="http://schemas.microsoft.com/office/word/2010/wordprocessingInk" xmlns:wne="http://schemas.microsoft.com/office/word/2006/wordml" xmlns:wps="http://schemas.microsoft.com/office/word/2010/wordprocessingShape" mc:Ignorable="w14 w15 w16se w16cid w16 w16cex w16sdtdh wp14">
+<w:endnotes xmlns:wpc="http://schemas.microsoft.com/office/word/2010/wordprocessingCanvas" xmlns:cx="http://schemas.microsoft.com/office/drawing/2014/chartex" xmlns:cx1="http://schemas.microsoft.com/office/drawing/2015/9/8/chartex" xmlns:cx2="http://schemas.microsoft.com/office/drawing/2015/10/21/chartex" xmlns:cx3="http://schemas.microsoft.com/office/drawing/2016/5/9/chartex" xmlns:cx4="http://schemas.microsoft.com/office/drawing/2016/5/10/chartex" xmlns:cx5="http://schemas.microsoft.com/office/drawing/2016/5/11/chartex" xmlns:cx6="http://schemas.microsoft.com/office/drawing/2016/5/12/chartex" xmlns:cx7="http://schemas.microsoft.com/office/drawing/2016/5/13/chartex" xmlns:cx8="http://schemas.microsoft.com/office/drawing/2016/5/14/chartex" xmlns:mc="http://schemas.openxmlformats.org/markup-compatibility/2006" xmlns:aink="http://schemas.microsoft.com/office/drawing/2016/ink" xmlns:am3d="http://schemas.microsoft.com/office/drawing/2017/model3d" xmlns:o="urn:schemas-microsoft-com:office:office" xmlns:oel="http://schemas.microsoft.com/office/2019/extlst" xmlns:r="http://schemas.openxmlformats.org/officeDocument/2006/relationships" xmlns:m="http://schemas.openxmlformats.org/officeDocument/2006/math" xmlns:v="urn:schemas-microsoft-com:vml" xmlns:wp14="http://schemas.microsoft.com/office/word/2010/wordprocessingDrawing" xmlns:wp="http://schemas.openxmlformats.org/drawingml/2006/wordprocessingDrawing" xmlns:w10="urn:schemas-microsoft-com:office:word" xmlns:w="http://schemas.openxmlformats.org/wordprocessingml/2006/main" xmlns:w14="http://schemas.microsoft.com/office/word/2010/wordml" xmlns:w15="http://schemas.microsoft.com/office/word/2012/wordml" xmlns:w16cex="http://schemas.microsoft.com/office/word/2018/wordml/cex" xmlns:w16cid="http://schemas.microsoft.com/office/word/2016/wordml/cid" xmlns:w16="http://schemas.microsoft.com/office/word/2018/wordml" xmlns:w16du="http://schemas.microsoft.com/office/word/2023/wordml/word16du" xmlns:w16sdtdh="http://schemas.microsoft.com/office/word/2020/wordml/sdtdatahash" xmlns:w16se="http://schemas.microsoft.com/office/word/2015/wordml/symex" xmlns:wpg="http://schemas.microsoft.com/office/word/2010/wordprocessingGroup" xmlns:wpi="http://schemas.microsoft.com/office/word/2010/wordprocessingInk" xmlns:wne="http://schemas.microsoft.com/office/word/2006/wordml" xmlns:wps="http://schemas.microsoft.com/office/word/2010/wordprocessingShape" mc:Ignorable="w14 w15 w16se w16cid w16 w16cex w16sdtdh w16du wp14">
   <w:endnote w:type="separator" w:id="-1">
     <w:p>
       <w:pPr>
@@ -4559,7 +4658,7 @@
 </file>
 
 <file path=word/footer1.xml><?xml version="1.0" encoding="utf-8"?>
-<w:ftr xmlns:wpc="http://schemas.microsoft.com/office/word/2010/wordprocessingCanvas" xmlns:cx="http://schemas.microsoft.com/office/drawing/2014/chartex" xmlns:cx1="http://schemas.microsoft.com/office/drawing/2015/9/8/chartex" xmlns:cx2="http://schemas.microsoft.com/office/drawing/2015/10/21/chartex" xmlns:cx3="http://schemas.microsoft.com/office/drawing/2016/5/9/chartex" xmlns:cx4="http://schemas.microsoft.com/office/drawing/2016/5/10/chartex" xmlns:cx5="http://schemas.microsoft.com/office/drawing/2016/5/11/chartex" xmlns:cx6="http://schemas.microsoft.com/office/drawing/2016/5/12/chartex" xmlns:cx7="http://schemas.microsoft.com/office/drawing/2016/5/13/chartex" xmlns:cx8="http://schemas.microsoft.com/office/drawing/2016/5/14/chartex" xmlns:mc="http://schemas.openxmlformats.org/markup-compatibility/2006" xmlns:aink="http://schemas.microsoft.com/office/drawing/2016/ink" xmlns:am3d="http://schemas.microsoft.com/office/drawing/2017/model3d" xmlns:o="urn:schemas-microsoft-com:office:office" xmlns:oel="http://schemas.microsoft.com/office/2019/extlst" xmlns:r="http://schemas.openxmlformats.org/officeDocument/2006/relationships" xmlns:m="http://schemas.openxmlformats.org/officeDocument/2006/math" xmlns:v="urn:schemas-microsoft-com:vml" xmlns:wp14="http://schemas.microsoft.com/office/word/2010/wordprocessingDrawing" xmlns:wp="http://schemas.openxmlformats.org/drawingml/2006/wordprocessingDrawing" xmlns:w10="urn:schemas-microsoft-com:office:word" xmlns:w="http://schemas.openxmlformats.org/wordprocessingml/2006/main" xmlns:w14="http://schemas.microsoft.com/office/word/2010/wordml" xmlns:w15="http://schemas.microsoft.com/office/word/2012/wordml" xmlns:w16cex="http://schemas.microsoft.com/office/word/2018/wordml/cex" xmlns:w16cid="http://schemas.microsoft.com/office/word/2016/wordml/cid" xmlns:w16="http://schemas.microsoft.com/office/word/2018/wordml" xmlns:w16sdtdh="http://schemas.microsoft.com/office/word/2020/wordml/sdtdatahash" xmlns:w16se="http://schemas.microsoft.com/office/word/2015/wordml/symex" xmlns:wpg="http://schemas.microsoft.com/office/word/2010/wordprocessingGroup" xmlns:wpi="http://schemas.microsoft.com/office/word/2010/wordprocessingInk" xmlns:wne="http://schemas.microsoft.com/office/word/2006/wordml" xmlns:wps="http://schemas.microsoft.com/office/word/2010/wordprocessingShape" mc:Ignorable="w14 w15 w16se w16cid w16 w16cex w16sdtdh wp14">
+<w:ftr xmlns:wpc="http://schemas.microsoft.com/office/word/2010/wordprocessingCanvas" xmlns:cx="http://schemas.microsoft.com/office/drawing/2014/chartex" xmlns:cx1="http://schemas.microsoft.com/office/drawing/2015/9/8/chartex" xmlns:cx2="http://schemas.microsoft.com/office/drawing/2015/10/21/chartex" xmlns:cx3="http://schemas.microsoft.com/office/drawing/2016/5/9/chartex" xmlns:cx4="http://schemas.microsoft.com/office/drawing/2016/5/10/chartex" xmlns:cx5="http://schemas.microsoft.com/office/drawing/2016/5/11/chartex" xmlns:cx6="http://schemas.microsoft.com/office/drawing/2016/5/12/chartex" xmlns:cx7="http://schemas.microsoft.com/office/drawing/2016/5/13/chartex" xmlns:cx8="http://schemas.microsoft.com/office/drawing/2016/5/14/chartex" xmlns:mc="http://schemas.openxmlformats.org/markup-compatibility/2006" xmlns:aink="http://schemas.microsoft.com/office/drawing/2016/ink" xmlns:am3d="http://schemas.microsoft.com/office/drawing/2017/model3d" xmlns:o="urn:schemas-microsoft-com:office:office" xmlns:oel="http://schemas.microsoft.com/office/2019/extlst" xmlns:r="http://schemas.openxmlformats.org/officeDocument/2006/relationships" xmlns:m="http://schemas.openxmlformats.org/officeDocument/2006/math" xmlns:v="urn:schemas-microsoft-com:vml" xmlns:wp14="http://schemas.microsoft.com/office/word/2010/wordprocessingDrawing" xmlns:wp="http://schemas.openxmlformats.org/drawingml/2006/wordprocessingDrawing" xmlns:w10="urn:schemas-microsoft-com:office:word" xmlns:w="http://schemas.openxmlformats.org/wordprocessingml/2006/main" xmlns:w14="http://schemas.microsoft.com/office/word/2010/wordml" xmlns:w15="http://schemas.microsoft.com/office/word/2012/wordml" xmlns:w16cex="http://schemas.microsoft.com/office/word/2018/wordml/cex" xmlns:w16cid="http://schemas.microsoft.com/office/word/2016/wordml/cid" xmlns:w16="http://schemas.microsoft.com/office/word/2018/wordml" xmlns:w16du="http://schemas.microsoft.com/office/word/2023/wordml/word16du" xmlns:w16sdtdh="http://schemas.microsoft.com/office/word/2020/wordml/sdtdatahash" xmlns:w16se="http://schemas.microsoft.com/office/word/2015/wordml/symex" xmlns:wpg="http://schemas.microsoft.com/office/word/2010/wordprocessingGroup" xmlns:wpi="http://schemas.microsoft.com/office/word/2010/wordprocessingInk" xmlns:wne="http://schemas.microsoft.com/office/word/2006/wordml" xmlns:wps="http://schemas.microsoft.com/office/word/2010/wordprocessingShape" mc:Ignorable="w14 w15 w16se w16cid w16 w16cex w16sdtdh w16du wp14">
   <w:p>
     <w:pPr>
       <w:pStyle w:val="Footer"/>
@@ -4578,7 +4677,7 @@
 </file>
 
 <file path=word/footnotes.xml><?xml version="1.0" encoding="utf-8"?>
-<w:footnotes xmlns:wpc="http://schemas.microsoft.com/office/word/2010/wordprocessingCanvas" xmlns:cx="http://schemas.microsoft.com/office/drawing/2014/chartex" xmlns:cx1="http://schemas.microsoft.com/office/drawing/2015/9/8/chartex" xmlns:cx2="http://schemas.microsoft.com/office/drawing/2015/10/21/chartex" xmlns:cx3="http://schemas.microsoft.com/office/drawing/2016/5/9/chartex" xmlns:cx4="http://schemas.microsoft.com/office/drawing/2016/5/10/chartex" xmlns:cx5="http://schemas.microsoft.com/office/drawing/2016/5/11/chartex" xmlns:cx6="http://schemas.microsoft.com/office/drawing/2016/5/12/chartex" xmlns:cx7="http://schemas.microsoft.com/office/drawing/2016/5/13/chartex" xmlns:cx8="http://schemas.microsoft.com/office/drawing/2016/5/14/chartex" xmlns:mc="http://schemas.openxmlformats.org/markup-compatibility/2006" xmlns:aink="http://schemas.microsoft.com/office/drawing/2016/ink" xmlns:am3d="http://schemas.microsoft.com/office/drawing/2017/model3d" xmlns:o="urn:schemas-microsoft-com:office:office" xmlns:oel="http://schemas.microsoft.com/office/2019/extlst" xmlns:r="http://schemas.openxmlformats.org/officeDocument/2006/relationships" xmlns:m="http://schemas.openxmlformats.org/officeDocument/2006/math" xmlns:v="urn:schemas-microsoft-com:vml" xmlns:wp14="http://schemas.microsoft.com/office/word/2010/wordprocessingDrawing" xmlns:wp="http://schemas.openxmlformats.org/drawingml/2006/wordprocessingDrawing" xmlns:w10="urn:schemas-microsoft-com:office:word" xmlns:w="http://schemas.openxmlformats.org/wordprocessingml/2006/main" xmlns:w14="http://schemas.microsoft.com/office/word/2010/wordml" xmlns:w15="http://schemas.microsoft.com/office/word/2012/wordml" xmlns:w16cex="http://schemas.microsoft.com/office/word/2018/wordml/cex" xmlns:w16cid="http://schemas.microsoft.com/office/word/2016/wordml/cid" xmlns:w16="http://schemas.microsoft.com/office/word/2018/wordml" xmlns:w16sdtdh="http://schemas.microsoft.com/office/word/2020/wordml/sdtdatahash" xmlns:w16se="http://schemas.microsoft.com/office/word/2015/wordml/symex" xmlns:wpg="http://schemas.microsoft.com/office/word/2010/wordprocessingGroup" xmlns:wpi="http://schemas.microsoft.com/office/word/2010/wordprocessingInk" xmlns:wne="http://schemas.microsoft.com/office/word/2006/wordml" xmlns:wps="http://schemas.microsoft.com/office/word/2010/wordprocessingShape" mc:Ignorable="w14 w15 w16se w16cid w16 w16cex w16sdtdh wp14">
+<w:footnotes xmlns:wpc="http://schemas.microsoft.com/office/word/2010/wordprocessingCanvas" xmlns:cx="http://schemas.microsoft.com/office/drawing/2014/chartex" xmlns:cx1="http://schemas.microsoft.com/office/drawing/2015/9/8/chartex" xmlns:cx2="http://schemas.microsoft.com/office/drawing/2015/10/21/chartex" xmlns:cx3="http://schemas.microsoft.com/office/drawing/2016/5/9/chartex" xmlns:cx4="http://schemas.microsoft.com/office/drawing/2016/5/10/chartex" xmlns:cx5="http://schemas.microsoft.com/office/drawing/2016/5/11/chartex" xmlns:cx6="http://schemas.microsoft.com/office/drawing/2016/5/12/chartex" xmlns:cx7="http://schemas.microsoft.com/office/drawing/2016/5/13/chartex" xmlns:cx8="http://schemas.microsoft.com/office/drawing/2016/5/14/chartex" xmlns:mc="http://schemas.openxmlformats.org/markup-compatibility/2006" xmlns:aink="http://schemas.microsoft.com/office/drawing/2016/ink" xmlns:am3d="http://schemas.microsoft.com/office/drawing/2017/model3d" xmlns:o="urn:schemas-microsoft-com:office:office" xmlns:oel="http://schemas.microsoft.com/office/2019/extlst" xmlns:r="http://schemas.openxmlformats.org/officeDocument/2006/relationships" xmlns:m="http://schemas.openxmlformats.org/officeDocument/2006/math" xmlns:v="urn:schemas-microsoft-com:vml" xmlns:wp14="http://schemas.microsoft.com/office/word/2010/wordprocessingDrawing" xmlns:wp="http://schemas.openxmlformats.org/drawingml/2006/wordprocessingDrawing" xmlns:w10="urn:schemas-microsoft-com:office:word" xmlns:w="http://schemas.openxmlformats.org/wordprocessingml/2006/main" xmlns:w14="http://schemas.microsoft.com/office/word/2010/wordml" xmlns:w15="http://schemas.microsoft.com/office/word/2012/wordml" xmlns:w16cex="http://schemas.microsoft.com/office/word/2018/wordml/cex" xmlns:w16cid="http://schemas.microsoft.com/office/word/2016/wordml/cid" xmlns:w16="http://schemas.microsoft.com/office/word/2018/wordml" xmlns:w16du="http://schemas.microsoft.com/office/word/2023/wordml/word16du" xmlns:w16sdtdh="http://schemas.microsoft.com/office/word/2020/wordml/sdtdatahash" xmlns:w16se="http://schemas.microsoft.com/office/word/2015/wordml/symex" xmlns:wpg="http://schemas.microsoft.com/office/word/2010/wordprocessingGroup" xmlns:wpi="http://schemas.microsoft.com/office/word/2010/wordprocessingInk" xmlns:wne="http://schemas.microsoft.com/office/word/2006/wordml" xmlns:wps="http://schemas.microsoft.com/office/word/2010/wordprocessingShape" mc:Ignorable="w14 w15 w16se w16cid w16 w16cex w16sdtdh w16du wp14">
   <w:footnote w:type="separator" w:id="-1">
     <w:p>
       <w:pPr>
@@ -4648,7 +4747,7 @@
 </file>
 
 <file path=word/numbering.xml><?xml version="1.0" encoding="utf-8"?>
-<w:numbering xmlns:wpc="http://schemas.microsoft.com/office/word/2010/wordprocessingCanvas" xmlns:cx="http://schemas.microsoft.com/office/drawing/2014/chartex" xmlns:cx1="http://schemas.microsoft.com/office/drawing/2015/9/8/chartex" xmlns:cx2="http://schemas.microsoft.com/office/drawing/2015/10/21/chartex" xmlns:cx3="http://schemas.microsoft.com/office/drawing/2016/5/9/chartex" xmlns:cx4="http://schemas.microsoft.com/office/drawing/2016/5/10/chartex" xmlns:cx5="http://schemas.microsoft.com/office/drawing/2016/5/11/chartex" xmlns:cx6="http://schemas.microsoft.com/office/drawing/2016/5/12/chartex" xmlns:cx7="http://schemas.microsoft.com/office/drawing/2016/5/13/chartex" xmlns:cx8="http://schemas.microsoft.com/office/drawing/2016/5/14/chartex" xmlns:mc="http://schemas.openxmlformats.org/markup-compatibility/2006" xmlns:aink="http://schemas.microsoft.com/office/drawing/2016/ink" xmlns:am3d="http://schemas.microsoft.com/office/drawing/2017/model3d" xmlns:o="urn:schemas-microsoft-com:office:office" xmlns:oel="http://schemas.microsoft.com/office/2019/extlst" xmlns:r="http://schemas.openxmlformats.org/officeDocument/2006/relationships" xmlns:m="http://schemas.openxmlformats.org/officeDocument/2006/math" xmlns:v="urn:schemas-microsoft-com:vml" xmlns:wp14="http://schemas.microsoft.com/office/word/2010/wordprocessingDrawing" xmlns:wp="http://schemas.openxmlformats.org/drawingml/2006/wordprocessingDrawing" xmlns:w10="urn:schemas-microsoft-com:office:word" xmlns:w="http://schemas.openxmlformats.org/wordprocessingml/2006/main" xmlns:w14="http://schemas.microsoft.com/office/word/2010/wordml" xmlns:w15="http://schemas.microsoft.com/office/word/2012/wordml" xmlns:w16cex="http://schemas.microsoft.com/office/word/2018/wordml/cex" xmlns:w16cid="http://schemas.microsoft.com/office/word/2016/wordml/cid" xmlns:w16="http://schemas.microsoft.com/office/word/2018/wordml" xmlns:w16sdtdh="http://schemas.microsoft.com/office/word/2020/wordml/sdtdatahash" xmlns:w16se="http://schemas.microsoft.com/office/word/2015/wordml/symex" xmlns:wpg="http://schemas.microsoft.com/office/word/2010/wordprocessingGroup" xmlns:wpi="http://schemas.microsoft.com/office/word/2010/wordprocessingInk" xmlns:wne="http://schemas.microsoft.com/office/word/2006/wordml" xmlns:wps="http://schemas.microsoft.com/office/word/2010/wordprocessingShape" mc:Ignorable="w14 w15 w16se w16cid w16 w16cex w16sdtdh wp14">
+<w:numbering xmlns:wpc="http://schemas.microsoft.com/office/word/2010/wordprocessingCanvas" xmlns:cx="http://schemas.microsoft.com/office/drawing/2014/chartex" xmlns:cx1="http://schemas.microsoft.com/office/drawing/2015/9/8/chartex" xmlns:cx2="http://schemas.microsoft.com/office/drawing/2015/10/21/chartex" xmlns:cx3="http://schemas.microsoft.com/office/drawing/2016/5/9/chartex" xmlns:cx4="http://schemas.microsoft.com/office/drawing/2016/5/10/chartex" xmlns:cx5="http://schemas.microsoft.com/office/drawing/2016/5/11/chartex" xmlns:cx6="http://schemas.microsoft.com/office/drawing/2016/5/12/chartex" xmlns:cx7="http://schemas.microsoft.com/office/drawing/2016/5/13/chartex" xmlns:cx8="http://schemas.microsoft.com/office/drawing/2016/5/14/chartex" xmlns:mc="http://schemas.openxmlformats.org/markup-compatibility/2006" xmlns:aink="http://schemas.microsoft.com/office/drawing/2016/ink" xmlns:am3d="http://schemas.microsoft.com/office/drawing/2017/model3d" xmlns:o="urn:schemas-microsoft-com:office:office" xmlns:oel="http://schemas.microsoft.com/office/2019/extlst" xmlns:r="http://schemas.openxmlformats.org/officeDocument/2006/relationships" xmlns:m="http://schemas.openxmlformats.org/officeDocument/2006/math" xmlns:v="urn:schemas-microsoft-com:vml" xmlns:wp14="http://schemas.microsoft.com/office/word/2010/wordprocessingDrawing" xmlns:wp="http://schemas.openxmlformats.org/drawingml/2006/wordprocessingDrawing" xmlns:w10="urn:schemas-microsoft-com:office:word" xmlns:w="http://schemas.openxmlformats.org/wordprocessingml/2006/main" xmlns:w14="http://schemas.microsoft.com/office/word/2010/wordml" xmlns:w15="http://schemas.microsoft.com/office/word/2012/wordml" xmlns:w16cex="http://schemas.microsoft.com/office/word/2018/wordml/cex" xmlns:w16cid="http://schemas.microsoft.com/office/word/2016/wordml/cid" xmlns:w16="http://schemas.microsoft.com/office/word/2018/wordml" xmlns:w16du="http://schemas.microsoft.com/office/word/2023/wordml/word16du" xmlns:w16sdtdh="http://schemas.microsoft.com/office/word/2020/wordml/sdtdatahash" xmlns:w16se="http://schemas.microsoft.com/office/word/2015/wordml/symex" xmlns:wpg="http://schemas.microsoft.com/office/word/2010/wordprocessingGroup" xmlns:wpi="http://schemas.microsoft.com/office/word/2010/wordprocessingInk" xmlns:wne="http://schemas.microsoft.com/office/word/2006/wordml" xmlns:wps="http://schemas.microsoft.com/office/word/2010/wordprocessingShape" mc:Ignorable="w14 w15 w16se w16cid w16 w16cex w16sdtdh w16du wp14">
   <w:abstractNum w:abstractNumId="0" w15:restartNumberingAfterBreak="0">
     <w:nsid w:val="02496734"/>
     <w:multiLevelType w:val="hybridMultilevel"/>
@@ -6110,7 +6209,7 @@
 </file>
 
 <file path=word/styles.xml><?xml version="1.0" encoding="utf-8"?>
-<w:styles xmlns:mc="http://schemas.openxmlformats.org/markup-compatibility/2006" xmlns:r="http://schemas.openxmlformats.org/officeDocument/2006/relationships" xmlns:w="http://schemas.openxmlformats.org/wordprocessingml/2006/main" xmlns:w14="http://schemas.microsoft.com/office/word/2010/wordml" xmlns:w15="http://schemas.microsoft.com/office/word/2012/wordml" xmlns:w16cex="http://schemas.microsoft.com/office/word/2018/wordml/cex" xmlns:w16cid="http://schemas.microsoft.com/office/word/2016/wordml/cid" xmlns:w16="http://schemas.microsoft.com/office/word/2018/wordml" xmlns:w16sdtdh="http://schemas.microsoft.com/office/word/2020/wordml/sdtdatahash" xmlns:w16se="http://schemas.microsoft.com/office/word/2015/wordml/symex" mc:Ignorable="w14 w15 w16se w16cid w16 w16cex w16sdtdh">
+<w:styles xmlns:mc="http://schemas.openxmlformats.org/markup-compatibility/2006" xmlns:r="http://schemas.openxmlformats.org/officeDocument/2006/relationships" xmlns:w="http://schemas.openxmlformats.org/wordprocessingml/2006/main" xmlns:w14="http://schemas.microsoft.com/office/word/2010/wordml" xmlns:w15="http://schemas.microsoft.com/office/word/2012/wordml" xmlns:w16cex="http://schemas.microsoft.com/office/word/2018/wordml/cex" xmlns:w16cid="http://schemas.microsoft.com/office/word/2016/wordml/cid" xmlns:w16="http://schemas.microsoft.com/office/word/2018/wordml" xmlns:w16du="http://schemas.microsoft.com/office/word/2023/wordml/word16du" xmlns:w16sdtdh="http://schemas.microsoft.com/office/word/2020/wordml/sdtdatahash" xmlns:w16se="http://schemas.microsoft.com/office/word/2015/wordml/symex" mc:Ignorable="w14 w15 w16se w16cid w16 w16cex w16sdtdh w16du">
   <w:docDefaults>
     <w:rPrDefault>
       <w:rPr>
@@ -14667,7 +14766,7 @@
       </w:tcPr>
     </w:tblStylePr>
   </w:style>
-  <w:style w:type="table" w:styleId="ColourfulShadingAccent5">
+  <w:style w:type="table" w:styleId="ColorfulShading-Accent5">
     <w:name w:val="Colorful Shading Accent 5"/>
     <w:basedOn w:val="TableNormal"/>
     <w:uiPriority w:val="71"/>
@@ -14782,7 +14881,7 @@
       </w:rPr>
     </w:tblStylePr>
   </w:style>
-  <w:style w:type="table" w:styleId="ColourfulShadingAccent4">
+  <w:style w:type="table" w:styleId="ColorfulShading-Accent4">
     <w:name w:val="Colorful Shading Accent 4"/>
     <w:basedOn w:val="TableNormal"/>
     <w:uiPriority w:val="71"/>
@@ -14897,7 +14996,7 @@
       </w:rPr>
     </w:tblStylePr>
   </w:style>
-  <w:style w:type="table" w:styleId="ColourfulShadingAccent3">
+  <w:style w:type="table" w:styleId="ColorfulShading-Accent3">
     <w:name w:val="Colorful Shading Accent 3"/>
     <w:basedOn w:val="TableNormal"/>
     <w:uiPriority w:val="71"/>
@@ -15002,7 +15101,7 @@
       </w:tcPr>
     </w:tblStylePr>
   </w:style>
-  <w:style w:type="table" w:styleId="ColourfulShadingAccent1">
+  <w:style w:type="table" w:styleId="ColorfulShading-Accent1">
     <w:name w:val="Colorful Shading Accent 1"/>
     <w:basedOn w:val="TableNormal"/>
     <w:uiPriority w:val="71"/>
@@ -15224,7 +15323,7 @@
       </w:tcPr>
     </w:tblStylePr>
   </w:style>
-  <w:style w:type="table" w:styleId="ColourfulShadingAccent6">
+  <w:style w:type="table" w:styleId="ColorfulShading-Accent6">
     <w:name w:val="Colorful Shading Accent 6"/>
     <w:basedOn w:val="TableNormal"/>
     <w:uiPriority w:val="71"/>
@@ -15339,7 +15438,7 @@
       </w:rPr>
     </w:tblStylePr>
   </w:style>
-  <w:style w:type="table" w:styleId="ColourfulList">
+  <w:style w:type="table" w:styleId="ColorfulList">
     <w:name w:val="Colorful List"/>
     <w:basedOn w:val="TableNormal"/>
     <w:uiPriority w:val="72"/>
@@ -15418,7 +15517,7 @@
       </w:tcPr>
     </w:tblStylePr>
   </w:style>
-  <w:style w:type="table" w:styleId="ColourfulListAccent1">
+  <w:style w:type="table" w:styleId="ColorfulList-Accent1">
     <w:name w:val="Colorful List Accent 1"/>
     <w:basedOn w:val="TableNormal"/>
     <w:uiPriority w:val="72"/>
@@ -15497,7 +15596,7 @@
       </w:tcPr>
     </w:tblStylePr>
   </w:style>
-  <w:style w:type="table" w:styleId="ColourfulListAccent2">
+  <w:style w:type="table" w:styleId="ColorfulList-Accent2">
     <w:name w:val="Colorful List Accent 2"/>
     <w:basedOn w:val="TableNormal"/>
     <w:uiPriority w:val="72"/>
@@ -15576,7 +15675,7 @@
       </w:tcPr>
     </w:tblStylePr>
   </w:style>
-  <w:style w:type="table" w:styleId="ColourfulListAccent3">
+  <w:style w:type="table" w:styleId="ColorfulList-Accent3">
     <w:name w:val="Colorful List Accent 3"/>
     <w:basedOn w:val="TableNormal"/>
     <w:uiPriority w:val="72"/>
@@ -15655,7 +15754,7 @@
       </w:tcPr>
     </w:tblStylePr>
   </w:style>
-  <w:style w:type="table" w:styleId="ColourfulListAccent4">
+  <w:style w:type="table" w:styleId="ColorfulList-Accent4">
     <w:name w:val="Colorful List Accent 4"/>
     <w:basedOn w:val="TableNormal"/>
     <w:uiPriority w:val="72"/>
@@ -15734,7 +15833,7 @@
       </w:tcPr>
     </w:tblStylePr>
   </w:style>
-  <w:style w:type="table" w:styleId="ColourfulListAccent5">
+  <w:style w:type="table" w:styleId="ColorfulList-Accent5">
     <w:name w:val="Colorful List Accent 5"/>
     <w:basedOn w:val="TableNormal"/>
     <w:uiPriority w:val="72"/>
@@ -15813,7 +15912,7 @@
       </w:tcPr>
     </w:tblStylePr>
   </w:style>
-  <w:style w:type="table" w:styleId="ColourfulGridAccent5">
+  <w:style w:type="table" w:styleId="ColorfulGrid-Accent5">
     <w:name w:val="Colorful Grid Accent 5"/>
     <w:basedOn w:val="TableNormal"/>
     <w:uiPriority w:val="73"/>
@@ -15886,7 +15985,7 @@
       </w:tcPr>
     </w:tblStylePr>
   </w:style>
-  <w:style w:type="table" w:styleId="ColourfulListAccent6">
+  <w:style w:type="table" w:styleId="ColorfulList-Accent6">
     <w:name w:val="Colorful List Accent 6"/>
     <w:basedOn w:val="TableNormal"/>
     <w:uiPriority w:val="72"/>
@@ -16349,7 +16448,6 @@
 <ds:datastoreItem xmlns:ds="http://schemas.openxmlformats.org/officeDocument/2006/customXml" ds:itemID="{1F4E5EA0-6AEA-48FC-A1BF-FBA8C12BE161}">
   <ds:schemaRefs>
     <ds:schemaRef ds:uri="http://schemas.openxmlformats.org/officeDocument/2006/bibliography"/>
-    <ds:schemaRef ds:uri="http://www.w3.org/2000/xmlns/"/>
   </ds:schemaRefs>
 </ds:datastoreItem>
 </file>
</xml_diff>